<commit_message>
updated report with new sections/charts
</commit_message>
<xml_diff>
--- a/EGX30_Report.docx
+++ b/EGX30_Report.docx
@@ -7,6 +7,66 @@
         <w:spacing w:before="600"/>
         <w:jc w:val="right"/>
       </w:pPr>
+      <w:r>
+        <w:rPr>
+          <w:noProof/>
+        </w:rPr>
+        <w:drawing>
+          <wp:anchor distT="0" distB="0" distL="114300" distR="114300" simplePos="0" relativeHeight="251659264" behindDoc="0" locked="0" layoutInCell="1" allowOverlap="1" wp14:anchorId="7F0E2B6C" wp14:editId="4A5AB083">
+            <wp:simplePos x="0" y="0"/>
+            <wp:positionH relativeFrom="margin">
+              <wp:posOffset>4556760</wp:posOffset>
+            </wp:positionH>
+            <wp:positionV relativeFrom="paragraph">
+              <wp:posOffset>0</wp:posOffset>
+            </wp:positionV>
+            <wp:extent cx="1386840" cy="1356360"/>
+            <wp:effectExtent l="0" t="0" r="3810" b="0"/>
+            <wp:wrapNone/>
+            <wp:docPr id="7" name="Picture 7"/>
+            <wp:cNvGraphicFramePr>
+              <a:graphicFrameLocks xmlns:a="http://schemas.openxmlformats.org/drawingml/2006/main" noChangeAspect="1"/>
+            </wp:cNvGraphicFramePr>
+            <a:graphic xmlns:a="http://schemas.openxmlformats.org/drawingml/2006/main">
+              <a:graphicData uri="http://schemas.openxmlformats.org/drawingml/2006/picture">
+                <pic:pic xmlns:pic="http://schemas.openxmlformats.org/drawingml/2006/picture">
+                  <pic:nvPicPr>
+                    <pic:cNvPr id="7" name="images (1).png"/>
+                    <pic:cNvPicPr/>
+                  </pic:nvPicPr>
+                  <pic:blipFill>
+                    <a:blip r:embed="rId7">
+                      <a:extLst>
+                        <a:ext uri="{28A0092B-C50C-407E-A947-70E740481C1C}">
+                          <a14:useLocalDpi xmlns:a14="http://schemas.microsoft.com/office/drawing/2010/main" val="0"/>
+                        </a:ext>
+                      </a:extLst>
+                    </a:blip>
+                    <a:stretch>
+                      <a:fillRect/>
+                    </a:stretch>
+                  </pic:blipFill>
+                  <pic:spPr>
+                    <a:xfrm>
+                      <a:off x="0" y="0"/>
+                      <a:ext cx="1386840" cy="1356360"/>
+                    </a:xfrm>
+                    <a:prstGeom prst="rect">
+                      <a:avLst/>
+                    </a:prstGeom>
+                  </pic:spPr>
+                </pic:pic>
+              </a:graphicData>
+            </a:graphic>
+            <wp14:sizeRelH relativeFrom="margin">
+              <wp14:pctWidth>0</wp14:pctWidth>
+            </wp14:sizeRelH>
+            <wp14:sizeRelV relativeFrom="margin">
+              <wp14:pctHeight>0</wp14:pctHeight>
+            </wp14:sizeRelV>
+          </wp:anchor>
+        </w:drawing>
+      </w:r>
       <w:r>
         <w:rPr>
           <w:noProof/>
@@ -35,7 +95,7 @@
                     <pic:cNvPicPr/>
                   </pic:nvPicPr>
                   <pic:blipFill>
-                    <a:blip r:embed="rId7">
+                    <a:blip r:embed="rId8">
                       <a:extLst>
                         <a:ext uri="{28A0092B-C50C-407E-A947-70E740481C1C}">
                           <a14:useLocalDpi xmlns:a14="http://schemas.microsoft.com/office/drawing/2010/main" val="0"/>
@@ -64,38 +124,6 @@
           </wp:anchor>
         </w:drawing>
       </w:r>
-      <w:r>
-        <w:rPr>
-          <w:color w:val="555555"/>
-        </w:rPr>
-        <w:t>Egypt University of Informatics</w:t>
-      </w:r>
-    </w:p>
-    <w:p>
-      <w:pPr>
-        <w:jc w:val="right"/>
-      </w:pPr>
-      <w:r>
-        <w:rPr>
-          <w:color w:val="555555"/>
-          <w:sz w:val="22"/>
-          <w:szCs w:val="22"/>
-        </w:rPr>
-        <w:t>Faculty of Computing &amp; Information Sciences</w:t>
-      </w:r>
-    </w:p>
-    <w:p>
-      <w:pPr>
-        <w:jc w:val="right"/>
-      </w:pPr>
-      <w:r>
-        <w:rPr>
-          <w:color w:val="555555"/>
-          <w:sz w:val="22"/>
-          <w:szCs w:val="22"/>
-        </w:rPr>
-        <w:t>Data Analysis Course (C-DE211)</w:t>
-      </w:r>
     </w:p>
     <w:p>
       <w:pPr>
@@ -178,17 +206,7 @@
           <w:sz w:val="28"/>
           <w:szCs w:val="28"/>
         </w:rPr>
-        <w:t xml:space="preserve">A look at whether Egyptian stock prices are growing for real, and whether </w:t>
-      </w:r>
-      <w:r>
-        <w:rPr>
-          <w:b/>
-          <w:bCs/>
-          <w:color w:val="666666"/>
-          <w:sz w:val="28"/>
-          <w:szCs w:val="28"/>
-        </w:rPr>
-        <w:t>different sectors move together or separately.</w:t>
+        <w:t>A look at whether Egyptian stock prices are growing for real, and whether different sectors move together or separately.</w:t>
       </w:r>
     </w:p>
     <w:p>
@@ -393,20 +411,8 @@
                 <w:sz w:val="22"/>
                 <w:szCs w:val="22"/>
               </w:rPr>
-              <w:t xml:space="preserve">Yousef </w:t>
-            </w:r>
-            <w:proofErr w:type="spellStart"/>
-            <w:r>
-              <w:rPr>
-                <w:color w:val="1F4E79" w:themeColor="accent1" w:themeShade="80"/>
-                <w:sz w:val="22"/>
-                <w:szCs w:val="22"/>
-              </w:rPr>
-              <w:t>mohamed</w:t>
-            </w:r>
-            <w:bookmarkStart w:id="0" w:name="_GoBack"/>
-            <w:bookmarkEnd w:id="0"/>
-            <w:proofErr w:type="spellEnd"/>
+              <w:t>Yousef mohamed</w:t>
+            </w:r>
           </w:p>
         </w:tc>
         <w:tc>
@@ -457,23 +463,13 @@
                 <w:color w:val="1F4E79" w:themeColor="accent1" w:themeShade="80"/>
               </w:rPr>
             </w:pPr>
-            <w:proofErr w:type="spellStart"/>
             <w:r>
               <w:rPr>
                 <w:color w:val="1F4E79" w:themeColor="accent1" w:themeShade="80"/>
                 <w:sz w:val="22"/>
                 <w:szCs w:val="22"/>
               </w:rPr>
-              <w:t>Taha</w:t>
-            </w:r>
-            <w:proofErr w:type="spellEnd"/>
-            <w:r>
-              <w:rPr>
-                <w:color w:val="1F4E79" w:themeColor="accent1" w:themeShade="80"/>
-                <w:sz w:val="22"/>
-                <w:szCs w:val="22"/>
-              </w:rPr>
-              <w:t xml:space="preserve"> Ahmed</w:t>
+              <w:t>Taha Ahmed</w:t>
             </w:r>
           </w:p>
         </w:tc>
@@ -525,34 +521,14 @@
                 <w:color w:val="1F4E79" w:themeColor="accent1" w:themeShade="80"/>
               </w:rPr>
             </w:pPr>
-            <w:proofErr w:type="spellStart"/>
             <w:r>
               <w:rPr>
                 <w:color w:val="1F4E79" w:themeColor="accent1" w:themeShade="80"/>
                 <w:sz w:val="22"/>
                 <w:szCs w:val="22"/>
               </w:rPr>
-              <w:t>Adham</w:t>
-            </w:r>
-            <w:proofErr w:type="spellEnd"/>
-            <w:r>
-              <w:rPr>
-                <w:color w:val="1F4E79" w:themeColor="accent1" w:themeShade="80"/>
-                <w:sz w:val="22"/>
-                <w:szCs w:val="22"/>
-              </w:rPr>
-              <w:t xml:space="preserve"> </w:t>
-            </w:r>
-            <w:proofErr w:type="spellStart"/>
-            <w:r>
-              <w:rPr>
-                <w:color w:val="1F4E79" w:themeColor="accent1" w:themeShade="80"/>
-                <w:sz w:val="22"/>
-                <w:szCs w:val="22"/>
-              </w:rPr>
-              <w:t>Abdo</w:t>
-            </w:r>
-            <w:proofErr w:type="spellEnd"/>
+              <w:t>Adham Abdo</w:t>
+            </w:r>
           </w:p>
         </w:tc>
         <w:tc>
@@ -588,8 +564,8 @@
     <w:p>
       <w:pPr>
         <w:sectPr>
-          <w:headerReference w:type="default" r:id="rId8"/>
-          <w:footerReference w:type="default" r:id="rId9"/>
+          <w:headerReference w:type="default" r:id="rId9"/>
+          <w:footerReference w:type="default" r:id="rId10"/>
           <w:pgSz w:w="12240" w:h="15840"/>
           <w:pgMar w:top="1440" w:right="1440" w:bottom="1440" w:left="1440" w:header="708" w:footer="708" w:gutter="0"/>
           <w:cols w:space="720"/>
@@ -611,10 +587,7 @@
         <w:spacing w:after="200"/>
       </w:pPr>
       <w:r>
-        <w:t>The Egyptian Exchange (EGX) is one of the oldest stock markets in the Middle East. The EGX30 index tracks Egypt’s 30 biggest and most traded companies, covering sectors like banking, real estate, telecom, finance, and industry. It gives us a good picture o</w:t>
-      </w:r>
-      <w:r>
-        <w:t>f how the Egyptian economy is doing.</w:t>
+        <w:t>The Egyptian Exchange (EGX) is one of the oldest stock markets in the Middle East. The EGX30 index tracks Egypt’s 30 biggest and most traded companies, covering sectors like banking, real estate, telecom, finance, and industry. It gives us a good picture of how the Egyptian economy is doing.</w:t>
       </w:r>
     </w:p>
     <w:p>
@@ -638,10 +611,7 @@
         <w:spacing w:after="200"/>
       </w:pPr>
       <w:r>
-        <w:t xml:space="preserve">In this report, we look at 10 of the top EGX30 stocks over 5 years (January 2021 to February 2026). We use charts, correlation analysis, and statistical tests to find out if </w:t>
-      </w:r>
-      <w:r>
-        <w:t>the growth is real, and whether different sectors behave the same way or differently.</w:t>
+        <w:t>In this report, we look at 10 of the top EGX30 stocks over 5 years (January 2021 to February 2026). We use charts, correlation analysis, and statistical tests to find out if the growth is real, and whether different sectors behave the same way or differently.</w:t>
       </w:r>
     </w:p>
     <w:p>
@@ -656,12 +626,15 @@
       <w:pPr>
         <w:spacing w:after="200"/>
       </w:pPr>
+      <w:r>
+        <w:t>Are EGX30 stock prices actually going up over time, or is it just random day-to-day movement? And do different sectors (like banking and real estate) go up at the same pace, or do they behave differently</w:t>
+      </w:r>
       <w:r>
         <w:rPr>
           <w:i/>
           <w:iCs/>
         </w:rPr>
-        <w:t>Are EGX30 stock prices actually going up over time, or is it just random day-to-day movement? And do different sectors (like banking and real estate) go up at the same pace, or do they behave differently?</w:t>
+        <w:t>?</w:t>
       </w:r>
     </w:p>
     <w:p>
@@ -681,7 +654,7 @@
           <w:b/>
           <w:bCs/>
         </w:rPr>
-        <w:t>Hypothesis 1 — Is each stock’s growth real?</w:t>
+        <w:t>Hypothesis 1 - Is each stock’s growth real?</w:t>
       </w:r>
     </w:p>
     <w:p>
@@ -732,7 +705,7 @@
           <w:b/>
           <w:bCs/>
         </w:rPr>
-        <w:t>Hypothesis 2 — Do sectors move differently?</w:t>
+        <w:t>Hypothesis 2 - Do sectors move differently?</w:t>
       </w:r>
     </w:p>
     <w:p>
@@ -771,10 +744,7 @@
         <w:t xml:space="preserve">H₁ (Alternative): </w:t>
       </w:r>
       <w:r>
-        <w:t>There is a s</w:t>
-      </w:r>
-      <w:r>
-        <w:t>ignificant difference between the two sectors.</w:t>
+        <w:t>There is a significant difference between the two sectors.</w:t>
       </w:r>
     </w:p>
     <w:p>
@@ -807,15 +777,16 @@
         <w:spacing w:after="200"/>
       </w:pPr>
       <w:r>
-        <w:t xml:space="preserve">We didn’t take a sample — we used every single trading day available. Each stock has 1,234 daily records, giving us 12,340 total data points across all 10 stocks. This means there’s no sampling bias because we’re looking at the complete picture, not just a slice of it. The data comes from a </w:t>
-      </w:r>
-      <w:proofErr w:type="spellStart"/>
-      <w:r>
-        <w:t>Kaggle</w:t>
-      </w:r>
-      <w:proofErr w:type="spellEnd"/>
-      <w:r>
-        <w:t xml:space="preserve"> dataset called “EGX Egyptian Stocks 2021–2026” which pulls from official exchange records.</w:t>
+        <w:t>We didn’t take a sample,</w:t>
+      </w:r>
+      <w:r>
+        <w:t xml:space="preserve"> we used every single trading day available. Each stock has 1,234 daily records, giving us 12,340 total data points across all 10 stocks. This means there’s no sampling bias because we’re looking at the complete picture, not just a slice of it. The data comes from a Kaggle dataset c</w:t>
+      </w:r>
+      <w:r>
+        <w:t>alled “EGX Egyptian Stocks 2021-</w:t>
+      </w:r>
+      <w:r>
+        <w:t>2026” which pulls from official exchange records.</w:t>
       </w:r>
     </w:p>
     <w:p>
@@ -823,10 +794,7 @@
         <w:pStyle w:val="heading10"/>
       </w:pPr>
       <w:r>
-        <w:t>Bias Id</w:t>
-      </w:r>
-      <w:r>
-        <w:t>entification</w:t>
+        <w:t>Bias Identification</w:t>
       </w:r>
     </w:p>
     <w:p>
@@ -908,18 +876,7 @@
         <w:spacing w:after="200"/>
       </w:pPr>
       <w:r>
-        <w:t xml:space="preserve">We got our data from </w:t>
-      </w:r>
-      <w:proofErr w:type="spellStart"/>
-      <w:r>
-        <w:t>Kaggle</w:t>
-      </w:r>
-      <w:proofErr w:type="spellEnd"/>
-      <w:r>
-        <w:t>. Each stock has a CSV file with 1,234 row</w:t>
-      </w:r>
-      <w:r>
-        <w:t>s (one row per trading day). Here are the columns in each file:</w:t>
+        <w:t>We got our data from Kaggle. Each stock has a CSV file with 1,234 rows (one row per trading day). Here are the columns in each file:</w:t>
       </w:r>
     </w:p>
     <w:tbl>
@@ -1714,7 +1671,6 @@
             </w:tcMar>
           </w:tcPr>
           <w:p>
-            <w:proofErr w:type="spellStart"/>
             <w:r>
               <w:rPr>
                 <w:color w:val="333333"/>
@@ -1723,7 +1679,6 @@
               </w:rPr>
               <w:t>dailyReturn</w:t>
             </w:r>
-            <w:proofErr w:type="spellEnd"/>
           </w:p>
         </w:tc>
         <w:tc>
@@ -2056,41 +2011,13 @@
             </w:tcMar>
           </w:tcPr>
           <w:p>
-            <w:proofErr w:type="spellStart"/>
-            <w:r>
-              <w:rPr>
-                <w:color w:val="333333"/>
-                <w:sz w:val="20"/>
-                <w:szCs w:val="20"/>
-              </w:rPr>
-              <w:t>Talaat</w:t>
-            </w:r>
-            <w:proofErr w:type="spellEnd"/>
-            <w:r>
-              <w:rPr>
-                <w:color w:val="333333"/>
-                <w:sz w:val="20"/>
-                <w:szCs w:val="20"/>
-              </w:rPr>
-              <w:t xml:space="preserve"> </w:t>
-            </w:r>
-            <w:proofErr w:type="spellStart"/>
-            <w:r>
-              <w:rPr>
-                <w:color w:val="333333"/>
-                <w:sz w:val="20"/>
-                <w:szCs w:val="20"/>
-              </w:rPr>
-              <w:t>Moustafa</w:t>
-            </w:r>
-            <w:proofErr w:type="spellEnd"/>
-            <w:r>
-              <w:rPr>
-                <w:color w:val="333333"/>
-                <w:sz w:val="20"/>
-                <w:szCs w:val="20"/>
-              </w:rPr>
-              <w:t xml:space="preserve"> Group</w:t>
+            <w:r>
+              <w:rPr>
+                <w:color w:val="333333"/>
+                <w:sz w:val="20"/>
+                <w:szCs w:val="20"/>
+              </w:rPr>
+              <w:t>Talaat Moustafa Group</w:t>
             </w:r>
           </w:p>
         </w:tc>
@@ -2594,25 +2521,7 @@
                 <w:sz w:val="20"/>
                 <w:szCs w:val="20"/>
               </w:rPr>
-              <w:t xml:space="preserve">El </w:t>
-            </w:r>
-            <w:proofErr w:type="spellStart"/>
-            <w:r>
-              <w:rPr>
-                <w:color w:val="333333"/>
-                <w:sz w:val="20"/>
-                <w:szCs w:val="20"/>
-              </w:rPr>
-              <w:t>Sewedy</w:t>
-            </w:r>
-            <w:proofErr w:type="spellEnd"/>
-            <w:r>
-              <w:rPr>
-                <w:color w:val="333333"/>
-                <w:sz w:val="20"/>
-                <w:szCs w:val="20"/>
-              </w:rPr>
-              <w:t xml:space="preserve"> Electric</w:t>
+              <w:t>El Sewedy Electric</w:t>
             </w:r>
           </w:p>
         </w:tc>
@@ -3116,25 +3025,7 @@
                 <w:sz w:val="20"/>
                 <w:szCs w:val="20"/>
               </w:rPr>
-              <w:t xml:space="preserve">Credit </w:t>
-            </w:r>
-            <w:proofErr w:type="spellStart"/>
-            <w:r>
-              <w:rPr>
-                <w:color w:val="333333"/>
-                <w:sz w:val="20"/>
-                <w:szCs w:val="20"/>
-              </w:rPr>
-              <w:t>Agricole</w:t>
-            </w:r>
-            <w:proofErr w:type="spellEnd"/>
-            <w:r>
-              <w:rPr>
-                <w:color w:val="333333"/>
-                <w:sz w:val="20"/>
-                <w:szCs w:val="20"/>
-              </w:rPr>
-              <w:t xml:space="preserve"> Egypt</w:t>
+              <w:t>Credit Agricole Egypt</w:t>
             </w:r>
           </w:p>
         </w:tc>
@@ -3788,12 +3679,9 @@
         <w:jc w:val="center"/>
       </w:pPr>
       <w:r>
-        <w:rPr>
-          <w:noProof/>
-        </w:rPr>
         <w:drawing>
-          <wp:inline distT="0" distB="0" distL="0" distR="0" wp14:anchorId="44F28259" wp14:editId="07777777">
-            <wp:extent cx="5334000" cy="2667000"/>
+          <wp:inline distT="0" distB="0" distL="0" distR="0" wp14:anchorId="1D9E64BF" wp14:editId="23A144B4">
+            <wp:extent cx="5943600" cy="2096770"/>
             <wp:effectExtent l="0" t="0" r="0" b="0"/>
             <wp:docPr id="1" name="Picture 1"/>
             <wp:cNvGraphicFramePr>
@@ -3803,22 +3691,19 @@
               <a:graphicData uri="http://schemas.openxmlformats.org/drawingml/2006/picture">
                 <pic:pic xmlns:pic="http://schemas.openxmlformats.org/drawingml/2006/picture">
                   <pic:nvPicPr>
-                    <pic:cNvPr id="0" name=""/>
-                    <pic:cNvPicPr>
-                      <a:picLocks noChangeAspect="1" noChangeArrowheads="1"/>
-                    </pic:cNvPicPr>
+                    <pic:cNvPr id="1" name=""/>
+                    <pic:cNvPicPr/>
                   </pic:nvPicPr>
                   <pic:blipFill>
-                    <a:blip r:embed="rId10"/>
-                    <a:srcRect/>
+                    <a:blip r:embed="rId11"/>
                     <a:stretch>
                       <a:fillRect/>
                     </a:stretch>
                   </pic:blipFill>
-                  <pic:spPr bwMode="auto">
+                  <pic:spPr>
                     <a:xfrm>
                       <a:off x="0" y="0"/>
-                      <a:ext cx="5334000" cy="2667000"/>
+                      <a:ext cx="5943600" cy="2096770"/>
                     </a:xfrm>
                     <a:prstGeom prst="rect">
                       <a:avLst/>
@@ -3839,13 +3724,19 @@
         <w:rPr>
           <w:b/>
           <w:bCs/>
-          <w:i/>
-          <w:iCs/>
-          <w:color w:val="555555"/>
           <w:sz w:val="20"/>
           <w:szCs w:val="20"/>
         </w:rPr>
-        <w:t>Figure 1: How the top 5 stock prices changed over 5 years.</w:t>
+        <w:t>Chart</w:t>
+      </w:r>
+      <w:r>
+        <w:rPr>
+          <w:b/>
+          <w:bCs/>
+          <w:sz w:val="20"/>
+          <w:szCs w:val="20"/>
+        </w:rPr>
+        <w:t xml:space="preserve"> 1: How the top 5 stock prices changed over 5 years.</w:t>
       </w:r>
     </w:p>
     <w:p>
@@ -3853,18 +3744,27 @@
         <w:spacing w:after="200"/>
       </w:pPr>
       <w:r>
-        <w:t xml:space="preserve">This chart shows the closing price of the 5 best-performing stocks from 2021 to 2026. All of them clearly went up over time. COMI reached the highest price (136.50 EGP), while TMGH had the most dramatic jump — going from around 6 EGP to over 90 EGP. </w:t>
-      </w:r>
+        <w:t>This chart shows the closing price of the 5 best-performing stocks from 2021 to 2026. All of them clearly went up over time. COMI reached the highest price (136.50 EGP), while TM</w:t>
+      </w:r>
+      <w:r>
+        <w:t xml:space="preserve">GH had the most dramatic jump, </w:t>
+      </w:r>
+      <w:r>
+        <w:t>going from around 6 EGP to over 90 EGP. The fact that all 5 stocks from different sectors grew at roughly the same time suggests that something bigger than just one company or o</w:t>
+      </w:r>
+      <w:r>
+        <w:t>ne sector is pushing prices up,</w:t>
+      </w:r>
+      <w:r>
+        <w:t xml:space="preserve"> likely economy-wide factors like currency devaluation and inflation.</w:t>
+      </w:r>
+    </w:p>
+    <w:p>
+      <w:pPr>
+        <w:pStyle w:val="heading20"/>
+      </w:pPr>
       <w:r>
         <w:lastRenderedPageBreak/>
-        <w:t>The fact that all 5 stocks from different sectors grew at roughly the same time suggests that something bigger than just one company or one sector is pushing prices up — likely economy-wide factors like currency devaluation and inflation.</w:t>
-      </w:r>
-    </w:p>
-    <w:p>
-      <w:pPr>
-        <w:pStyle w:val="heading20"/>
-      </w:pPr>
-      <w:r>
         <w:t>Trading Volume</w:t>
       </w:r>
     </w:p>
@@ -3873,14 +3773,11 @@
         <w:jc w:val="center"/>
       </w:pPr>
       <w:r>
-        <w:rPr>
-          <w:noProof/>
-        </w:rPr>
         <w:drawing>
-          <wp:inline distT="0" distB="0" distL="0" distR="0" wp14:anchorId="7EB11689" wp14:editId="07777777">
-            <wp:extent cx="5334000" cy="2667000"/>
+          <wp:inline distT="0" distB="0" distL="0" distR="0" wp14:anchorId="5E1A8F56" wp14:editId="5D8295C8">
+            <wp:extent cx="5943600" cy="2096770"/>
             <wp:effectExtent l="0" t="0" r="0" b="0"/>
-            <wp:docPr id="1114301630" name="Picture 1114301630"/>
+            <wp:docPr id="9" name="Picture 9"/>
             <wp:cNvGraphicFramePr>
               <a:graphicFrameLocks xmlns:a="http://schemas.openxmlformats.org/drawingml/2006/main" noChangeAspect="1"/>
             </wp:cNvGraphicFramePr>
@@ -3888,22 +3785,19 @@
               <a:graphicData uri="http://schemas.openxmlformats.org/drawingml/2006/picture">
                 <pic:pic xmlns:pic="http://schemas.openxmlformats.org/drawingml/2006/picture">
                   <pic:nvPicPr>
-                    <pic:cNvPr id="0" name=""/>
-                    <pic:cNvPicPr>
-                      <a:picLocks noChangeAspect="1" noChangeArrowheads="1"/>
-                    </pic:cNvPicPr>
+                    <pic:cNvPr id="1" name=""/>
+                    <pic:cNvPicPr/>
                   </pic:nvPicPr>
                   <pic:blipFill>
-                    <a:blip r:embed="rId11"/>
-                    <a:srcRect/>
+                    <a:blip r:embed="rId12"/>
                     <a:stretch>
                       <a:fillRect/>
                     </a:stretch>
                   </pic:blipFill>
-                  <pic:spPr bwMode="auto">
+                  <pic:spPr>
                     <a:xfrm>
                       <a:off x="0" y="0"/>
-                      <a:ext cx="5334000" cy="2667000"/>
+                      <a:ext cx="5943600" cy="2096770"/>
                     </a:xfrm>
                     <a:prstGeom prst="rect">
                       <a:avLst/>
@@ -3919,18 +3813,28 @@
     <w:p>
       <w:pPr>
         <w:spacing w:before="120" w:after="200"/>
-      </w:pPr>
-      <w:r>
         <w:rPr>
           <w:b/>
           <w:bCs/>
-          <w:i/>
-          <w:iCs/>
-          <w:color w:val="555555"/>
+        </w:rPr>
+      </w:pPr>
+      <w:r>
+        <w:rPr>
+          <w:b/>
+          <w:bCs/>
           <w:sz w:val="20"/>
           <w:szCs w:val="20"/>
         </w:rPr>
-        <w:t>Figure 2: How many shares were traded each day.</w:t>
+        <w:t>Chart</w:t>
+      </w:r>
+      <w:r>
+        <w:rPr>
+          <w:b/>
+          <w:bCs/>
+          <w:sz w:val="20"/>
+          <w:szCs w:val="20"/>
+        </w:rPr>
+        <w:t xml:space="preserve"> 2: How many shares were traded each day.</w:t>
       </w:r>
     </w:p>
     <w:p>
@@ -3938,7 +3842,7 @@
         <w:spacing w:after="200"/>
       </w:pPr>
       <w:r>
-        <w:t>This chart shows trading activity. PHDC (Palm Hills) is by far the most actively traded stock. When you look at the spikes, they tend to happen across multiple stocks at the same time. This tells us that when big news hits (like a Central Bank decision), the whole market reacts at once — not just one sector.</w:t>
+        <w:t>This chart shows trading activity. PHDC (Palm Hills) is by far the most actively traded stock. When you look at the spikes, they tend to happen across multiple stocks at the same time. This tells us that when big news hits (like a Central Bank decision), the whole market reacts at once - not just one sector.</w:t>
       </w:r>
     </w:p>
     <w:p>
@@ -3954,15 +3858,11 @@
         <w:jc w:val="center"/>
       </w:pPr>
       <w:r>
-        <w:rPr>
-          <w:noProof/>
-        </w:rPr>
-        <w:lastRenderedPageBreak/>
         <w:drawing>
-          <wp:inline distT="0" distB="0" distL="0" distR="0" wp14:anchorId="42A7724E" wp14:editId="07777777">
-            <wp:extent cx="4572000" cy="3810000"/>
-            <wp:effectExtent l="0" t="0" r="0" b="0"/>
-            <wp:docPr id="413189736" name="Picture 413189736"/>
+          <wp:inline distT="0" distB="0" distL="0" distR="0" wp14:anchorId="026742D3" wp14:editId="0C51976E">
+            <wp:extent cx="4089400" cy="3530603"/>
+            <wp:effectExtent l="0" t="0" r="6350" b="0"/>
+            <wp:docPr id="12" name="Picture 12"/>
             <wp:cNvGraphicFramePr>
               <a:graphicFrameLocks xmlns:a="http://schemas.openxmlformats.org/drawingml/2006/main" noChangeAspect="1"/>
             </wp:cNvGraphicFramePr>
@@ -3970,22 +3870,19 @@
               <a:graphicData uri="http://schemas.openxmlformats.org/drawingml/2006/picture">
                 <pic:pic xmlns:pic="http://schemas.openxmlformats.org/drawingml/2006/picture">
                   <pic:nvPicPr>
-                    <pic:cNvPr id="0" name=""/>
-                    <pic:cNvPicPr>
-                      <a:picLocks noChangeAspect="1" noChangeArrowheads="1"/>
-                    </pic:cNvPicPr>
+                    <pic:cNvPr id="1" name=""/>
+                    <pic:cNvPicPr/>
                   </pic:nvPicPr>
                   <pic:blipFill>
-                    <a:blip r:embed="rId12"/>
-                    <a:srcRect/>
+                    <a:blip r:embed="rId13"/>
                     <a:stretch>
                       <a:fillRect/>
                     </a:stretch>
                   </pic:blipFill>
-                  <pic:spPr bwMode="auto">
+                  <pic:spPr>
                     <a:xfrm>
                       <a:off x="0" y="0"/>
-                      <a:ext cx="4572000" cy="3810000"/>
+                      <a:ext cx="4093614" cy="3534241"/>
                     </a:xfrm>
                     <a:prstGeom prst="rect">
                       <a:avLst/>
@@ -4002,26 +3899,31 @@
       <w:pPr>
         <w:spacing w:before="120" w:after="200"/>
       </w:pPr>
+      <w:proofErr w:type="spellStart"/>
       <w:r>
         <w:rPr>
           <w:b/>
           <w:bCs/>
-          <w:i/>
-          <w:iCs/>
-          <w:color w:val="555555"/>
           <w:sz w:val="20"/>
           <w:szCs w:val="20"/>
         </w:rPr>
-        <w:t xml:space="preserve">Figure 3: Correlation </w:t>
-      </w:r>
-      <w:proofErr w:type="spellStart"/>
+        <w:t>Heatmap</w:t>
+      </w:r>
+      <w:proofErr w:type="spellEnd"/>
       <w:r>
         <w:rPr>
           <w:b/>
           <w:bCs/>
-          <w:i/>
-          <w:iCs/>
-          <w:color w:val="555555"/>
+          <w:sz w:val="20"/>
+          <w:szCs w:val="20"/>
+        </w:rPr>
+        <w:t xml:space="preserve"> 3: Correlation </w:t>
+      </w:r>
+      <w:proofErr w:type="spellStart"/>
+      <w:r>
+        <w:rPr>
+          <w:b/>
+          <w:bCs/>
           <w:sz w:val="20"/>
           <w:szCs w:val="20"/>
         </w:rPr>
@@ -4032,25 +3934,10 @@
         <w:rPr>
           <w:b/>
           <w:bCs/>
-          <w:i/>
-          <w:iCs/>
-          <w:color w:val="555555"/>
           <w:sz w:val="20"/>
           <w:szCs w:val="20"/>
         </w:rPr>
-        <w:t xml:space="preserve"> showing how similar</w:t>
-      </w:r>
-      <w:r>
-        <w:rPr>
-          <w:b/>
-          <w:bCs/>
-          <w:i/>
-          <w:iCs/>
-          <w:color w:val="555555"/>
-          <w:sz w:val="20"/>
-          <w:szCs w:val="20"/>
-        </w:rPr>
-        <w:t>ly each pair of stocks moves.</w:t>
+        <w:t xml:space="preserve"> showing how similarly each pair of stocks moves.</w:t>
       </w:r>
     </w:p>
     <w:p>
@@ -4058,18 +3945,34 @@
         <w:spacing w:after="200"/>
       </w:pPr>
       <w:r>
-        <w:t xml:space="preserve">This </w:t>
-      </w:r>
-      <w:proofErr w:type="spellStart"/>
-      <w:r>
-        <w:t>heatmap</w:t>
-      </w:r>
-      <w:proofErr w:type="spellEnd"/>
-      <w:r>
-        <w:t xml:space="preserve"> shows the correlation between every pair of stocks. A value of 1.0 would mean they move in perfect sync; 0.0 means no relationship at all. The strongest pair is TMGH–PHDC (both real estate) at 0.43, which is moder</w:t>
-      </w:r>
-      <w:r>
-        <w:t>ate. Most pairs are in the 0.15–0.40 range, meaning stocks tend to move in the same general direction but not in lockstep. CANA (Suez Canal Bank) is the most independent stock — it barely correlates with anything else.</w:t>
+        <w:t xml:space="preserve">This heatmap shows the correlation between every pair of stocks. A value of 1.0 would mean they move in perfect sync; 0.0 means no relationship at </w:t>
+      </w:r>
+      <w:r>
+        <w:t xml:space="preserve">all. The strongest pair is </w:t>
+      </w:r>
+      <w:r>
+        <w:lastRenderedPageBreak/>
+        <w:t>TMGH-</w:t>
+      </w:r>
+      <w:r>
+        <w:t>PHDC (both real estate) at 0.43, which is moder</w:t>
+      </w:r>
+      <w:r>
+        <w:t>ate. Most pairs are in the 0.15-</w:t>
+      </w:r>
+      <w:r>
+        <w:t>0.40 range, meaning stocks tend to move in the same general direction but not in lockstep. CANA (Suez Canal Bank)</w:t>
+      </w:r>
+      <w:r>
+        <w:t xml:space="preserve"> is the most independent </w:t>
+      </w:r>
+      <w:proofErr w:type="gramStart"/>
+      <w:r>
+        <w:t>stock ,</w:t>
+      </w:r>
+      <w:proofErr w:type="gramEnd"/>
+      <w:r>
+        <w:t xml:space="preserve"> it barely correlates with anything else.</w:t>
       </w:r>
     </w:p>
     <w:p>
@@ -4085,15 +3988,11 @@
         <w:jc w:val="center"/>
       </w:pPr>
       <w:r>
-        <w:rPr>
-          <w:noProof/>
-        </w:rPr>
-        <w:lastRenderedPageBreak/>
         <w:drawing>
-          <wp:inline distT="0" distB="0" distL="0" distR="0" wp14:anchorId="575C624B" wp14:editId="07777777">
-            <wp:extent cx="4572000" cy="2667000"/>
+          <wp:inline distT="0" distB="0" distL="0" distR="0" wp14:anchorId="1864DFCC" wp14:editId="15552630">
+            <wp:extent cx="5943600" cy="2096770"/>
             <wp:effectExtent l="0" t="0" r="0" b="0"/>
-            <wp:docPr id="1574086510" name="Picture 1574086510"/>
+            <wp:docPr id="10" name="Picture 10"/>
             <wp:cNvGraphicFramePr>
               <a:graphicFrameLocks xmlns:a="http://schemas.openxmlformats.org/drawingml/2006/main" noChangeAspect="1"/>
             </wp:cNvGraphicFramePr>
@@ -4101,22 +4000,19 @@
               <a:graphicData uri="http://schemas.openxmlformats.org/drawingml/2006/picture">
                 <pic:pic xmlns:pic="http://schemas.openxmlformats.org/drawingml/2006/picture">
                   <pic:nvPicPr>
-                    <pic:cNvPr id="0" name=""/>
-                    <pic:cNvPicPr>
-                      <a:picLocks noChangeAspect="1" noChangeArrowheads="1"/>
-                    </pic:cNvPicPr>
+                    <pic:cNvPr id="1" name=""/>
+                    <pic:cNvPicPr/>
                   </pic:nvPicPr>
                   <pic:blipFill>
-                    <a:blip r:embed="rId13"/>
-                    <a:srcRect/>
+                    <a:blip r:embed="rId14"/>
                     <a:stretch>
                       <a:fillRect/>
                     </a:stretch>
                   </pic:blipFill>
-                  <pic:spPr bwMode="auto">
+                  <pic:spPr>
                     <a:xfrm>
                       <a:off x="0" y="0"/>
-                      <a:ext cx="4572000" cy="2667000"/>
+                      <a:ext cx="5943600" cy="2096770"/>
                     </a:xfrm>
                     <a:prstGeom prst="rect">
                       <a:avLst/>
@@ -4137,51 +4033,28 @@
         <w:rPr>
           <w:b/>
           <w:bCs/>
-          <w:i/>
-          <w:iCs/>
-          <w:color w:val="555555"/>
           <w:sz w:val="20"/>
           <w:szCs w:val="20"/>
         </w:rPr>
-        <w:t xml:space="preserve">Figure </w:t>
+        <w:t>Chart</w:t>
       </w:r>
       <w:r>
         <w:rPr>
           <w:b/>
           <w:bCs/>
-          <w:i/>
-          <w:iCs/>
-          <w:color w:val="555555"/>
           <w:sz w:val="20"/>
           <w:szCs w:val="20"/>
         </w:rPr>
-        <w:t xml:space="preserve">4: Average daily return per sector, measured in basis points (1 </w:t>
-      </w:r>
-      <w:proofErr w:type="spellStart"/>
+        <w:t xml:space="preserve"> 4: Average daily return per sector,</w:t>
+      </w:r>
       <w:r>
         <w:rPr>
           <w:b/>
           <w:bCs/>
-          <w:i/>
-          <w:iCs/>
-          <w:color w:val="555555"/>
           <w:sz w:val="20"/>
           <w:szCs w:val="20"/>
         </w:rPr>
-        <w:t>bp</w:t>
-      </w:r>
-      <w:proofErr w:type="spellEnd"/>
-      <w:r>
-        <w:rPr>
-          <w:b/>
-          <w:bCs/>
-          <w:i/>
-          <w:iCs/>
-          <w:color w:val="555555"/>
-          <w:sz w:val="20"/>
-          <w:szCs w:val="20"/>
-        </w:rPr>
-        <w:t xml:space="preserve"> = 0.01%).</w:t>
+        <w:t xml:space="preserve"> measured in basis points</w:t>
       </w:r>
     </w:p>
     <w:p>
@@ -4189,7 +4062,13 @@
         <w:spacing w:after="200"/>
       </w:pPr>
       <w:r>
-        <w:t>Industry (SWDY) and Telecom (ETEL) had the highest average daily returns, while Finance (HRHO, CCAP) had the lowest. But here’s the key finding: even though the bars look different, our statistical test (shown later) found that these differences are too small to be meaningful. Statistically, all sectors grew at roughly the same pace.</w:t>
+        <w:t>Industry (SWDY) and Telecom (ETEL) had the highest average daily returns, while Finance (HRHO, CCAP) had the low</w:t>
+      </w:r>
+      <w:r>
+        <w:t>est</w:t>
+      </w:r>
+      <w:r>
+        <w:t>. Statistically, all sectors grew at roughly the same pace.</w:t>
       </w:r>
     </w:p>
     <w:p>
@@ -4205,14 +4084,11 @@
         <w:jc w:val="center"/>
       </w:pPr>
       <w:r>
-        <w:rPr>
-          <w:noProof/>
-        </w:rPr>
         <w:drawing>
-          <wp:inline distT="0" distB="0" distL="0" distR="0" wp14:anchorId="75387BBB" wp14:editId="07777777">
-            <wp:extent cx="5334000" cy="2667000"/>
+          <wp:inline distT="0" distB="0" distL="0" distR="0" wp14:anchorId="26E1890E" wp14:editId="4EAB9864">
+            <wp:extent cx="5943600" cy="2096770"/>
             <wp:effectExtent l="0" t="0" r="0" b="0"/>
-            <wp:docPr id="1598502777" name="Picture 1598502777"/>
+            <wp:docPr id="11" name="Picture 11"/>
             <wp:cNvGraphicFramePr>
               <a:graphicFrameLocks xmlns:a="http://schemas.openxmlformats.org/drawingml/2006/main" noChangeAspect="1"/>
             </wp:cNvGraphicFramePr>
@@ -4220,22 +4096,19 @@
               <a:graphicData uri="http://schemas.openxmlformats.org/drawingml/2006/picture">
                 <pic:pic xmlns:pic="http://schemas.openxmlformats.org/drawingml/2006/picture">
                   <pic:nvPicPr>
-                    <pic:cNvPr id="0" name=""/>
-                    <pic:cNvPicPr>
-                      <a:picLocks noChangeAspect="1" noChangeArrowheads="1"/>
-                    </pic:cNvPicPr>
+                    <pic:cNvPr id="1" name=""/>
+                    <pic:cNvPicPr/>
                   </pic:nvPicPr>
                   <pic:blipFill>
                     <a:blip r:embed="rId14"/>
-                    <a:srcRect/>
                     <a:stretch>
                       <a:fillRect/>
                     </a:stretch>
                   </pic:blipFill>
-                  <pic:spPr bwMode="auto">
+                  <pic:spPr>
                     <a:xfrm>
                       <a:off x="0" y="0"/>
-                      <a:ext cx="5334000" cy="2667000"/>
+                      <a:ext cx="5943600" cy="2096770"/>
                     </a:xfrm>
                     <a:prstGeom prst="rect">
                       <a:avLst/>
@@ -4256,25 +4129,19 @@
         <w:rPr>
           <w:b/>
           <w:bCs/>
-          <w:i/>
-          <w:iCs/>
-          <w:color w:val="555555"/>
           <w:sz w:val="20"/>
           <w:szCs w:val="20"/>
         </w:rPr>
-        <w:t>Figure 5: 30-day average of daily returns for each sector, plotted on t</w:t>
+        <w:t>Chart</w:t>
       </w:r>
       <w:r>
         <w:rPr>
           <w:b/>
           <w:bCs/>
-          <w:i/>
-          <w:iCs/>
-          <w:color w:val="555555"/>
           <w:sz w:val="20"/>
           <w:szCs w:val="20"/>
         </w:rPr>
-        <w:t>op of each other.</w:t>
+        <w:t xml:space="preserve"> 5: 30-day average of daily returns for each sector, plotted on top of each other.</w:t>
       </w:r>
     </w:p>
     <w:p>
@@ -4282,7 +4149,7 @@
         <w:spacing w:after="200"/>
       </w:pPr>
       <w:r>
-        <w:t>This is one of the most telling charts. All five sector lines move almost identically — when one goes up, they all go up, and when one dips, they all dip together. This confirms that the Egyptian market moves as one big unit, not as separate sectors. The reason is likely that macro forces (currency, inflation, interest rates) affect every company at the same time.</w:t>
+        <w:t>This is one of the most telling charts. All five sector lines move almost identically - when one goes up, they all go up, and when one dips, they all dip together. This confirms that the Egyptian market moves as one big unit, not as separate sectors. The reason is likely that macro forces (currency, inflation, interest rates) affect every company at the same time.</w:t>
       </w:r>
     </w:p>
     <w:p>
@@ -4337,7 +4204,7 @@
         <w:t xml:space="preserve">The rule: </w:t>
       </w:r>
       <w:r>
-        <w:t>If the p-value is below 0.05, we say the result is statistically significant — the growth is real. If it’s above 0.05, we can’t be sure.</w:t>
+        <w:t>If the p-value is below 0.05, we say the result is statistically significant - the growth is real. If it’s above 0.05, we can’t be sure.</w:t>
       </w:r>
     </w:p>
     <w:p>
@@ -4349,7 +4216,7 @@
           <w:b/>
           <w:bCs/>
         </w:rPr>
-        <w:t>Step 1 — Hypotheses:</w:t>
+        <w:t>Step 1 - Hypotheses:</w:t>
       </w:r>
     </w:p>
     <w:p>
@@ -4388,10 +4255,7 @@
         <w:t xml:space="preserve">H₁: </w:t>
       </w:r>
       <w:r>
-        <w:t>Average daily return ≠ 0 (t</w:t>
-      </w:r>
-      <w:r>
-        <w:t>here’s a real trend).</w:t>
+        <w:t>Average daily return ≠ 0 (there’s a real trend).</w:t>
       </w:r>
     </w:p>
     <w:p>
@@ -4403,7 +4267,7 @@
           <w:b/>
           <w:bCs/>
         </w:rPr>
-        <w:t xml:space="preserve">Step 2 — Significance level: </w:t>
+        <w:t xml:space="preserve">Step 2 - Significance level: </w:t>
       </w:r>
       <w:r>
         <w:t>α = 0.05 (95% confidence).</w:t>
@@ -4418,18 +4282,10 @@
           <w:b/>
           <w:bCs/>
         </w:rPr>
-        <w:t xml:space="preserve">Step 3 — Run the test: </w:t>
-      </w:r>
-      <w:r>
-        <w:t xml:space="preserve">We used Python’s </w:t>
-      </w:r>
-      <w:proofErr w:type="gramStart"/>
-      <w:r>
-        <w:t>scipy.stats</w:t>
-      </w:r>
-      <w:proofErr w:type="gramEnd"/>
-      <w:r>
-        <w:t>.ttest_1samp on each stock’s daily returns.</w:t>
+        <w:t xml:space="preserve">Step 3 - Run the test: </w:t>
+      </w:r>
+      <w:r>
+        <w:t>We used Python’s scipy.stats.ttest_1samp on each stock’s daily returns.</w:t>
       </w:r>
     </w:p>
     <w:p>
@@ -4441,7 +4297,7 @@
           <w:b/>
           <w:bCs/>
         </w:rPr>
-        <w:t>Step 4 — Results:</w:t>
+        <w:t>Step 4 - Results:</w:t>
       </w:r>
     </w:p>
     <w:tbl>
@@ -4513,7 +4369,6 @@
             </w:tcMar>
           </w:tcPr>
           <w:p>
-            <w:proofErr w:type="spellStart"/>
             <w:r>
               <w:rPr>
                 <w:b/>
@@ -4522,18 +4377,7 @@
                 <w:sz w:val="20"/>
                 <w:szCs w:val="20"/>
               </w:rPr>
-              <w:t>Avg</w:t>
-            </w:r>
-            <w:proofErr w:type="spellEnd"/>
-            <w:r>
-              <w:rPr>
-                <w:b/>
-                <w:bCs/>
-                <w:color w:val="FFFFFF"/>
-                <w:sz w:val="20"/>
-                <w:szCs w:val="20"/>
-              </w:rPr>
-              <w:t xml:space="preserve"> Return</w:t>
+              <w:t>Avg Return</w:t>
             </w:r>
           </w:p>
         </w:tc>
@@ -6031,7 +5875,7 @@
         <w:t xml:space="preserve">Bottom line: </w:t>
       </w:r>
       <w:r>
-        <w:t>8 out of 10 stocks have p-values below 0.05, which means their growth is statistically real — not random luck. The two that didn’t pass (OCDI and CCAP) had either very weak growth or too much volatility for the test to give a clear answer.</w:t>
+        <w:t>8 out of 10 stocks have p-values below 0.05, which means their growth is statistically real - not random luck. The two that didn’t pass (OCDI and CCAP) had either very weak growth or too much volatility for the test to give a clear answer.</w:t>
       </w:r>
     </w:p>
     <w:p>
@@ -6054,15 +5898,7 @@
         <w:t xml:space="preserve">What we’re testing: </w:t>
       </w:r>
       <w:r>
-        <w:t xml:space="preserve">We compare the daily returns of Banking stocks against Real Estate stocks (and Banking </w:t>
-      </w:r>
-      <w:proofErr w:type="gramStart"/>
-      <w:r>
-        <w:t>vs</w:t>
-      </w:r>
-      <w:proofErr w:type="gramEnd"/>
-      <w:r>
-        <w:t xml:space="preserve"> Finance) to see if one sector grows faster than the other.</w:t>
+        <w:t>We compare the daily returns of Banking stocks against Real Estate stocks (and Banking vs Finance) to see if one sector grows faster than the other.</w:t>
       </w:r>
     </w:p>
     <w:p>
@@ -6075,7 +5911,7 @@
           <w:bCs/>
         </w:rPr>
         <w:lastRenderedPageBreak/>
-        <w:t>Step 1 — Hypotheses:</w:t>
+        <w:t>Step 1 - Hypotheses:</w:t>
       </w:r>
     </w:p>
     <w:p>
@@ -6144,20 +5980,7 @@
         <w:t xml:space="preserve">Step 3: </w:t>
       </w:r>
       <w:r>
-        <w:t xml:space="preserve">We pooled all daily returns from each sector and compared them using </w:t>
-      </w:r>
-      <w:proofErr w:type="spellStart"/>
-      <w:proofErr w:type="gramStart"/>
-      <w:r>
-        <w:t>scipy.stats</w:t>
-      </w:r>
-      <w:proofErr w:type="gramEnd"/>
-      <w:r>
-        <w:t>.ttest_ind</w:t>
-      </w:r>
-      <w:proofErr w:type="spellEnd"/>
-      <w:r>
-        <w:t>.</w:t>
+        <w:t>We pooled all daily returns from each sector and compared them using scipy.stats.ttest_ind.</w:t>
       </w:r>
     </w:p>
     <w:p>
@@ -6169,12 +5992,12 @@
           <w:b/>
           <w:bCs/>
         </w:rPr>
-        <w:t>Step 4 — Results:</w:t>
+        <w:t>Step 4 - Results:</w:t>
       </w:r>
     </w:p>
     <w:tbl>
       <w:tblPr>
-        <w:tblW w:w="9360" w:type="dxa"/>
+        <w:tblW w:w="7860" w:type="dxa"/>
         <w:tblBorders>
           <w:top w:val="single" w:sz="4" w:space="0" w:color="auto"/>
           <w:left w:val="single" w:sz="4" w:space="0" w:color="auto"/>
@@ -6188,7 +6011,6 @@
       <w:tblGrid>
         <w:gridCol w:w="3000"/>
         <w:gridCol w:w="1500"/>
-        <w:gridCol w:w="1500"/>
         <w:gridCol w:w="3360"/>
       </w:tblGrid>
       <w:tr>
@@ -6248,13 +6070,13 @@
                 <w:sz w:val="20"/>
                 <w:szCs w:val="20"/>
               </w:rPr>
-              <w:t>t-stat</w:t>
-            </w:r>
-          </w:p>
-        </w:tc>
-        <w:tc>
-          <w:tcPr>
-            <w:tcW w:w="1500" w:type="dxa"/>
+              <w:t>p-value</w:t>
+            </w:r>
+          </w:p>
+        </w:tc>
+        <w:tc>
+          <w:tcPr>
+            <w:tcW w:w="3360" w:type="dxa"/>
             <w:tcBorders>
               <w:top w:val="single" w:sz="1" w:space="0" w:color="CCCCCC"/>
               <w:left w:val="single" w:sz="1" w:space="0" w:color="CCCCCC"/>
@@ -6278,36 +6100,6 @@
                 <w:sz w:val="20"/>
                 <w:szCs w:val="20"/>
               </w:rPr>
-              <w:t>p-value</w:t>
-            </w:r>
-          </w:p>
-        </w:tc>
-        <w:tc>
-          <w:tcPr>
-            <w:tcW w:w="3360" w:type="dxa"/>
-            <w:tcBorders>
-              <w:top w:val="single" w:sz="1" w:space="0" w:color="CCCCCC"/>
-              <w:left w:val="single" w:sz="1" w:space="0" w:color="CCCCCC"/>
-              <w:bottom w:val="single" w:sz="1" w:space="0" w:color="CCCCCC"/>
-              <w:right w:val="single" w:sz="1" w:space="0" w:color="CCCCCC"/>
-            </w:tcBorders>
-            <w:shd w:val="clear" w:color="auto" w:fill="0A1628"/>
-            <w:tcMar>
-              <w:top w:w="80" w:type="dxa"/>
-              <w:left w:w="120" w:type="dxa"/>
-              <w:bottom w:w="80" w:type="dxa"/>
-              <w:right w:w="120" w:type="dxa"/>
-            </w:tcMar>
-          </w:tcPr>
-          <w:p>
-            <w:r>
-              <w:rPr>
-                <w:b/>
-                <w:bCs/>
-                <w:color w:val="FFFFFF"/>
-                <w:sz w:val="20"/>
-                <w:szCs w:val="20"/>
-              </w:rPr>
               <w:t>What It Means</w:t>
             </w:r>
           </w:p>
@@ -6358,40 +6150,59 @@
             </w:tcMar>
           </w:tcPr>
           <w:p>
-            <w:r>
-              <w:rPr>
-                <w:color w:val="333333"/>
-                <w:sz w:val="20"/>
-                <w:szCs w:val="20"/>
-              </w:rPr>
-              <w:t>-0.249</w:t>
-            </w:r>
-          </w:p>
-        </w:tc>
-        <w:tc>
-          <w:tcPr>
-            <w:tcW w:w="1500" w:type="dxa"/>
-            <w:tcBorders>
-              <w:top w:val="single" w:sz="1" w:space="0" w:color="CCCCCC"/>
-              <w:left w:val="single" w:sz="1" w:space="0" w:color="CCCCCC"/>
-              <w:bottom w:val="single" w:sz="1" w:space="0" w:color="CCCCCC"/>
-              <w:right w:val="single" w:sz="1" w:space="0" w:color="CCCCCC"/>
-            </w:tcBorders>
-            <w:tcMar>
-              <w:top w:w="80" w:type="dxa"/>
-              <w:left w:w="120" w:type="dxa"/>
-              <w:bottom w:w="80" w:type="dxa"/>
-              <w:right w:w="120" w:type="dxa"/>
-            </w:tcMar>
-          </w:tcPr>
-          <w:p>
-            <w:r>
-              <w:rPr>
-                <w:color w:val="333333"/>
-                <w:sz w:val="20"/>
-                <w:szCs w:val="20"/>
-              </w:rPr>
-              <w:t>0.803</w:t>
+            <w:pPr>
+              <w:rPr>
+                <w:rFonts w:asciiTheme="minorBidi" w:hAnsiTheme="minorBidi" w:cstheme="minorBidi"/>
+                <w:color w:val="000000" w:themeColor="text1"/>
+                <w14:shadow w14:blurRad="38100" w14:dist="19050" w14:dir="2700000" w14:sx="100000" w14:sy="100000" w14:kx="0" w14:ky="0" w14:algn="tl">
+                  <w14:schemeClr w14:val="dk1">
+                    <w14:alpha w14:val="60000"/>
+                  </w14:schemeClr>
+                </w14:shadow>
+                <w14:textOutline w14:w="0" w14:cap="flat" w14:cmpd="sng" w14:algn="ctr">
+                  <w14:noFill/>
+                  <w14:prstDash w14:val="solid"/>
+                  <w14:round/>
+                </w14:textOutline>
+              </w:rPr>
+            </w:pPr>
+            <w:r>
+              <w:rPr>
+                <w:rFonts w:asciiTheme="minorBidi" w:hAnsiTheme="minorBidi" w:cstheme="minorBidi"/>
+                <w:color w:val="000000" w:themeColor="text1"/>
+                <w:sz w:val="21"/>
+                <w:szCs w:val="21"/>
+                <w14:shadow w14:blurRad="38100" w14:dist="19050" w14:dir="2700000" w14:sx="100000" w14:sy="100000" w14:kx="0" w14:ky="0" w14:algn="tl">
+                  <w14:schemeClr w14:val="dk1">
+                    <w14:alpha w14:val="60000"/>
+                  </w14:schemeClr>
+                </w14:shadow>
+                <w14:textOutline w14:w="0" w14:cap="flat" w14:cmpd="sng" w14:algn="ctr">
+                  <w14:noFill/>
+                  <w14:prstDash w14:val="solid"/>
+                  <w14:round/>
+                </w14:textOutline>
+              </w:rPr>
+              <w:t>0.</w:t>
+            </w:r>
+            <w:r>
+              <w:rPr>
+                <w:rFonts w:asciiTheme="minorBidi" w:hAnsiTheme="minorBidi" w:cstheme="minorBidi"/>
+                <w:color w:val="000000" w:themeColor="text1"/>
+                <w:sz w:val="20"/>
+                <w:szCs w:val="20"/>
+                <w14:shadow w14:blurRad="38100" w14:dist="19050" w14:dir="2700000" w14:sx="100000" w14:sy="100000" w14:kx="0" w14:ky="0" w14:algn="tl">
+                  <w14:schemeClr w14:val="dk1">
+                    <w14:alpha w14:val="60000"/>
+                  </w14:schemeClr>
+                </w14:shadow>
+                <w14:textOutline w14:w="0" w14:cap="flat" w14:cmpd="sng" w14:algn="ctr">
+                  <w14:noFill/>
+                  <w14:prstDash w14:val="solid"/>
+                  <w14:round/>
+                </w14:textOutline>
+              </w:rPr>
+              <w:t>2784</w:t>
             </w:r>
           </w:p>
         </w:tc>
@@ -6418,7 +6229,7 @@
                 <w:sz w:val="20"/>
                 <w:szCs w:val="20"/>
               </w:rPr>
-              <w:t>No real difference — they move together</w:t>
+              <w:t>No real difference , they move together</w:t>
             </w:r>
           </w:p>
         </w:tc>
@@ -6474,33 +6285,6 @@
                 <w:sz w:val="20"/>
                 <w:szCs w:val="20"/>
               </w:rPr>
-              <w:t>0.702</w:t>
-            </w:r>
-          </w:p>
-        </w:tc>
-        <w:tc>
-          <w:tcPr>
-            <w:tcW w:w="1500" w:type="dxa"/>
-            <w:tcBorders>
-              <w:top w:val="single" w:sz="1" w:space="0" w:color="CCCCCC"/>
-              <w:left w:val="single" w:sz="1" w:space="0" w:color="CCCCCC"/>
-              <w:bottom w:val="single" w:sz="1" w:space="0" w:color="CCCCCC"/>
-              <w:right w:val="single" w:sz="1" w:space="0" w:color="CCCCCC"/>
-            </w:tcBorders>
-            <w:tcMar>
-              <w:top w:w="80" w:type="dxa"/>
-              <w:left w:w="120" w:type="dxa"/>
-              <w:bottom w:w="80" w:type="dxa"/>
-              <w:right w:w="120" w:type="dxa"/>
-            </w:tcMar>
-          </w:tcPr>
-          <w:p>
-            <w:r>
-              <w:rPr>
-                <w:color w:val="333333"/>
-                <w:sz w:val="20"/>
-                <w:szCs w:val="20"/>
-              </w:rPr>
               <w:t>0.483</w:t>
             </w:r>
           </w:p>
@@ -6528,7 +6312,7 @@
                 <w:sz w:val="20"/>
                 <w:szCs w:val="20"/>
               </w:rPr>
-              <w:t>No real difference — they move together</w:t>
+              <w:t>No real difference , they move together</w:t>
             </w:r>
           </w:p>
         </w:tc>
@@ -6546,7 +6330,67 @@
         <w:t xml:space="preserve">Bottom line: </w:t>
       </w:r>
       <w:r>
-        <w:t>Both p-values are way above 0.05 (0.803 and 0.483), so there’s no significant difference between sectors. Banking, Real Estate, and Finance stocks all grow at roughly the same rate. The market moves as one unit.</w:t>
+        <w:t>Both p-values are way above 0.05 (</w:t>
+      </w:r>
+      <w:r>
+        <w:rPr>
+          <w:rFonts w:asciiTheme="minorBidi" w:hAnsiTheme="minorBidi" w:cstheme="minorBidi"/>
+          <w:color w:val="000000" w:themeColor="text1"/>
+          <w:sz w:val="21"/>
+          <w:szCs w:val="21"/>
+          <w14:shadow w14:blurRad="38100" w14:dist="19050" w14:dir="2700000" w14:sx="100000" w14:sy="100000" w14:kx="0" w14:ky="0" w14:algn="tl">
+            <w14:schemeClr w14:val="dk1">
+              <w14:alpha w14:val="60000"/>
+            </w14:schemeClr>
+          </w14:shadow>
+          <w14:textOutline w14:w="0" w14:cap="flat" w14:cmpd="sng" w14:algn="ctr">
+            <w14:noFill/>
+            <w14:prstDash w14:val="solid"/>
+            <w14:round/>
+          </w14:textOutline>
+        </w:rPr>
+        <w:t>0.</w:t>
+      </w:r>
+      <w:r>
+        <w:rPr>
+          <w:rFonts w:asciiTheme="minorBidi" w:hAnsiTheme="minorBidi" w:cstheme="minorBidi"/>
+          <w:color w:val="000000" w:themeColor="text1"/>
+          <w:sz w:val="20"/>
+          <w:szCs w:val="20"/>
+          <w14:shadow w14:blurRad="38100" w14:dist="19050" w14:dir="2700000" w14:sx="100000" w14:sy="100000" w14:kx="0" w14:ky="0" w14:algn="tl">
+            <w14:schemeClr w14:val="dk1">
+              <w14:alpha w14:val="60000"/>
+            </w14:schemeClr>
+          </w14:shadow>
+          <w14:textOutline w14:w="0" w14:cap="flat" w14:cmpd="sng" w14:algn="ctr">
+            <w14:noFill/>
+            <w14:prstDash w14:val="solid"/>
+            <w14:round/>
+          </w14:textOutline>
+        </w:rPr>
+        <w:t>2784</w:t>
+      </w:r>
+      <w:r>
+        <w:rPr>
+          <w:rFonts w:asciiTheme="minorBidi" w:hAnsiTheme="minorBidi" w:cstheme="minorBidi"/>
+          <w:color w:val="000000" w:themeColor="text1"/>
+          <w:sz w:val="20"/>
+          <w:szCs w:val="20"/>
+          <w14:shadow w14:blurRad="38100" w14:dist="19050" w14:dir="2700000" w14:sx="100000" w14:sy="100000" w14:kx="0" w14:ky="0" w14:algn="tl">
+            <w14:schemeClr w14:val="dk1">
+              <w14:alpha w14:val="60000"/>
+            </w14:schemeClr>
+          </w14:shadow>
+          <w14:textOutline w14:w="0" w14:cap="flat" w14:cmpd="sng" w14:algn="ctr">
+            <w14:noFill/>
+            <w14:prstDash w14:val="solid"/>
+            <w14:round/>
+          </w14:textOutline>
+        </w:rPr>
+        <w:t xml:space="preserve"> </w:t>
+      </w:r>
+      <w:r>
+        <w:t>and 0.483), so there’s no significant difference between sectors. Banking, Real Estate, and Finance stocks all grow at roughly the same rate. The market moves as one unit.</w:t>
       </w:r>
     </w:p>
     <w:p>
@@ -6562,7 +6406,19 @@
         <w:spacing w:after="200"/>
       </w:pPr>
       <w:r>
-        <w:t>At first, these two results might seem contradictory: “Stocks have real trends” but also “Sectors aren’t different.” But they’re actually answering two different questions:</w:t>
+        <w:t xml:space="preserve">At first, these two results might seem </w:t>
+      </w:r>
+      <w:r>
+        <w:t xml:space="preserve">contradictory: </w:t>
+      </w:r>
+      <w:r>
+        <w:t>Sto</w:t>
+      </w:r>
+      <w:r>
+        <w:t>cks have real trends but also Sectors aren’t different.</w:t>
+      </w:r>
+      <w:r>
+        <w:t xml:space="preserve"> But they’re answering two different questions:</w:t>
       </w:r>
     </w:p>
     <w:p>
@@ -6581,10 +6437,18 @@
         <w:t xml:space="preserve">Test 1 says: </w:t>
       </w:r>
       <w:r>
-        <w:t xml:space="preserve">“Yes, stocks are genuinely </w:t>
-      </w:r>
-      <w:r>
-        <w:t>going up — it’s not random.”</w:t>
+        <w:t xml:space="preserve">Yes, </w:t>
+      </w:r>
+      <w:r>
+        <w:t xml:space="preserve">stocks are genuinely going </w:t>
+      </w:r>
+      <w:proofErr w:type="gramStart"/>
+      <w:r>
+        <w:t>up ,</w:t>
+      </w:r>
+      <w:proofErr w:type="gramEnd"/>
+      <w:r>
+        <w:t xml:space="preserve"> it’s not random.</w:t>
       </w:r>
     </w:p>
     <w:p>
@@ -6604,7 +6468,10 @@
         <w:t xml:space="preserve">Test 2 says: </w:t>
       </w:r>
       <w:r>
-        <w:t>“And they’re all going up together at the same pace.”</w:t>
+        <w:t>And they’re all going up together at th</w:t>
+      </w:r>
+      <w:r>
+        <w:t>e same pace.</w:t>
       </w:r>
     </w:p>
     <w:p>
@@ -6612,15 +6479,539 @@
         <w:spacing w:after="200"/>
       </w:pPr>
       <w:r>
-        <w:t xml:space="preserve">This makes perfect sense when you think about what happened in Egypt during 2021–2026. The Egyptian pound lost a huge amount of value, inflation was high, and the Central Bank kept raising interest rates. These forces pushed all stock prices up across the board — not just one sector. So every stock has a real upward trend (Test 1), AND all sectors follow the same rhythm (Test 2). They’re two sides of the same coin: </w:t>
+        <w:t>This makes perfect sense when you think about wha</w:t>
+      </w:r>
+      <w:r>
+        <w:t>t happened in Egypt during 2021-</w:t>
+      </w:r>
+      <w:r>
+        <w:t xml:space="preserve">2026. The Egyptian pound lost a huge amount of value, inflation was high, and the Central Bank kept raising interest rates. These forces pushed all stock prices up across the board - not just one sector. So every stock has a real upward trend (Test 1), </w:t>
+      </w:r>
+      <w:r>
+        <w:t>and</w:t>
+      </w:r>
+      <w:r>
+        <w:t xml:space="preserve"> all sectors follow the same rhythm (Test 2). They’re two sides of the same coin: the Egyptian market is driven by shared economic forces, not random company-by-company events.</w:t>
+      </w:r>
+    </w:p>
+    <w:p>
+      <w:pPr>
+        <w:pStyle w:val="heading10"/>
+      </w:pPr>
+      <w:r>
+        <w:t>Descriptive Statistics</w:t>
+      </w:r>
+    </w:p>
+    <w:p>
+      <w:pPr>
+        <w:spacing w:after="200"/>
+      </w:pPr>
+      <w:r>
+        <w:t>We calculated summary statistics for each stock’s daily returns: mean, median, standard deviation, and skewness. This gives us a clearer picture of which stocks were more stable and which were more volatile. We also plotted a Risk vs Return scatter to see at a glance how each stock balances reward against risk.</w:t>
+      </w:r>
+    </w:p>
+    <w:p>
+      <w:pPr>
+        <w:pStyle w:val="heading20"/>
+      </w:pPr>
+      <w:r>
+        <w:t>Risk vs Return</w:t>
+      </w:r>
+    </w:p>
+    <w:p>
+      <w:r>
+        <w:lastRenderedPageBreak/>
+        <w:drawing>
+          <wp:inline distT="0" distB="0" distL="0" distR="0" wp14:anchorId="18E14D31" wp14:editId="789D97D9">
+            <wp:extent cx="4503420" cy="2493240"/>
+            <wp:effectExtent l="0" t="0" r="0" b="2540"/>
+            <wp:docPr id="2" name="Picture 2"/>
+            <wp:cNvGraphicFramePr>
+              <a:graphicFrameLocks xmlns:a="http://schemas.openxmlformats.org/drawingml/2006/main" noChangeAspect="1"/>
+            </wp:cNvGraphicFramePr>
+            <a:graphic xmlns:a="http://schemas.openxmlformats.org/drawingml/2006/main">
+              <a:graphicData uri="http://schemas.openxmlformats.org/drawingml/2006/picture">
+                <pic:pic xmlns:pic="http://schemas.openxmlformats.org/drawingml/2006/picture">
+                  <pic:nvPicPr>
+                    <pic:cNvPr id="1" name=""/>
+                    <pic:cNvPicPr/>
+                  </pic:nvPicPr>
+                  <pic:blipFill>
+                    <a:blip r:embed="rId15"/>
+                    <a:stretch>
+                      <a:fillRect/>
+                    </a:stretch>
+                  </pic:blipFill>
+                  <pic:spPr>
+                    <a:xfrm>
+                      <a:off x="0" y="0"/>
+                      <a:ext cx="4508068" cy="2495813"/>
+                    </a:xfrm>
+                    <a:prstGeom prst="rect">
+                      <a:avLst/>
+                    </a:prstGeom>
+                  </pic:spPr>
+                </pic:pic>
+              </a:graphicData>
+            </a:graphic>
+          </wp:inline>
+        </w:drawing>
+      </w:r>
+    </w:p>
+    <w:p>
+      <w:pPr>
+        <w:spacing w:before="120" w:after="200"/>
+      </w:pPr>
+      <w:r>
+        <w:rPr>
+          <w:b/>
+          <w:bCs/>
+          <w:sz w:val="20"/>
+          <w:szCs w:val="20"/>
+        </w:rPr>
+        <w:t>Chart</w:t>
+      </w:r>
+      <w:r>
+        <w:rPr>
+          <w:b/>
+          <w:bCs/>
+          <w:sz w:val="20"/>
+          <w:szCs w:val="20"/>
+        </w:rPr>
+        <w:t xml:space="preserve"> 6: Risk vs Return scatter plot - all 10 stocks.</w:t>
+      </w:r>
+    </w:p>
+    <w:p>
+      <w:pPr>
+        <w:spacing w:after="200"/>
+      </w:pPr>
+      <w:r>
+        <w:t xml:space="preserve">The Risk </w:t>
       </w:r>
       <w:proofErr w:type="gramStart"/>
       <w:r>
-        <w:t>the</w:t>
+        <w:t>vs</w:t>
       </w:r>
       <w:proofErr w:type="gramEnd"/>
       <w:r>
-        <w:t xml:space="preserve"> Egyptian market is driven by shared economic forces, not random company-by-company events.</w:t>
+        <w:t xml:space="preserve"> Return scatter shows that higher returns came with higher volatility across all 10 stocks. SWDY and TMGH sit in the upper-right, meaning they delivered the strongest gains but with the most daily swings. COMI and CIEB cluster near the lower-left, reflecting the more stable nature of established banks. Most stocks have skewness above zero, meaning occasional very large positive days are more common than large negative ones. The kurtosis values above 3 for </w:t>
+      </w:r>
+      <w:r>
+        <w:t xml:space="preserve">most stocks indicate fat </w:t>
+      </w:r>
+      <w:proofErr w:type="gramStart"/>
+      <w:r>
+        <w:t>tails ,</w:t>
+      </w:r>
+      <w:proofErr w:type="gramEnd"/>
+      <w:r>
+        <w:t xml:space="preserve"> extreme days happen more often than a normal distribution would predict, which is typical in emerging markets like Egypt.</w:t>
+      </w:r>
+    </w:p>
+    <w:p>
+      <w:pPr>
+        <w:pStyle w:val="heading10"/>
+      </w:pPr>
+      <w:r>
+        <w:t>Volatility Event Study</w:t>
+      </w:r>
+    </w:p>
+    <w:p>
+      <w:pPr>
+        <w:spacing w:after="200"/>
+      </w:pPr>
+      <w:r>
+        <w:t>Egypt experienced three major currency devaluation events during our study perio</w:t>
+      </w:r>
+      <w:r>
+        <w:t xml:space="preserve">d: March 2022 (EGP moved from </w:t>
+      </w:r>
+      <w:r>
+        <w:t>1</w:t>
+      </w:r>
+      <w:r>
+        <w:t xml:space="preserve">5.7 to </w:t>
+      </w:r>
+      <w:r>
+        <w:t>18.5 per U</w:t>
+      </w:r>
+      <w:r>
+        <w:t xml:space="preserve">SD), October 2022 (from 18.5 to </w:t>
+      </w:r>
+      <w:r>
+        <w:t>23 pe</w:t>
+      </w:r>
+      <w:r>
+        <w:t xml:space="preserve">r USD), and January 2024 (from 30 to </w:t>
+      </w:r>
+      <w:r>
+        <w:t xml:space="preserve">50 per </w:t>
+      </w:r>
+      <w:proofErr w:type="gramStart"/>
+      <w:r>
+        <w:t>USD ,</w:t>
+      </w:r>
+      <w:proofErr w:type="gramEnd"/>
+      <w:r>
+        <w:t xml:space="preserve"> </w:t>
+      </w:r>
+      <w:r>
+        <w:t>the biggest one). We studied whether these events caused measurable spikes in market volatility by comparing the 30-day windows before and after each event.</w:t>
+      </w:r>
+    </w:p>
+    <w:p>
+      <w:pPr>
+        <w:pStyle w:val="heading20"/>
+      </w:pPr>
+      <w:r>
+        <w:t>Rolling Volatility with Devaluation Events</w:t>
+      </w:r>
+    </w:p>
+    <w:p>
+      <w:r>
+        <w:drawing>
+          <wp:inline distT="0" distB="0" distL="0" distR="0" wp14:anchorId="26B54B66" wp14:editId="621FEF6A">
+            <wp:extent cx="5588000" cy="1971322"/>
+            <wp:effectExtent l="0" t="0" r="0" b="0"/>
+            <wp:docPr id="3" name="Picture 3"/>
+            <wp:cNvGraphicFramePr>
+              <a:graphicFrameLocks xmlns:a="http://schemas.openxmlformats.org/drawingml/2006/main" noChangeAspect="1"/>
+            </wp:cNvGraphicFramePr>
+            <a:graphic xmlns:a="http://schemas.openxmlformats.org/drawingml/2006/main">
+              <a:graphicData uri="http://schemas.openxmlformats.org/drawingml/2006/picture">
+                <pic:pic xmlns:pic="http://schemas.openxmlformats.org/drawingml/2006/picture">
+                  <pic:nvPicPr>
+                    <pic:cNvPr id="1" name=""/>
+                    <pic:cNvPicPr/>
+                  </pic:nvPicPr>
+                  <pic:blipFill>
+                    <a:blip r:embed="rId16"/>
+                    <a:stretch>
+                      <a:fillRect/>
+                    </a:stretch>
+                  </pic:blipFill>
+                  <pic:spPr>
+                    <a:xfrm>
+                      <a:off x="0" y="0"/>
+                      <a:ext cx="5611851" cy="1979736"/>
+                    </a:xfrm>
+                    <a:prstGeom prst="rect">
+                      <a:avLst/>
+                    </a:prstGeom>
+                  </pic:spPr>
+                </pic:pic>
+              </a:graphicData>
+            </a:graphic>
+          </wp:inline>
+        </w:drawing>
+      </w:r>
+    </w:p>
+    <w:p>
+      <w:pPr>
+        <w:spacing w:before="120" w:after="200"/>
+      </w:pPr>
+      <w:r>
+        <w:rPr>
+          <w:b/>
+          <w:bCs/>
+          <w:sz w:val="20"/>
+          <w:szCs w:val="20"/>
+        </w:rPr>
+        <w:lastRenderedPageBreak/>
+        <w:t>Chart</w:t>
+      </w:r>
+      <w:r>
+        <w:rPr>
+          <w:b/>
+          <w:bCs/>
+          <w:sz w:val="20"/>
+          <w:szCs w:val="20"/>
+        </w:rPr>
+        <w:t xml:space="preserve"> 7: Rolling 20-day volatility with EGP devaluation events marked.</w:t>
+      </w:r>
+    </w:p>
+    <w:p>
+      <w:pPr>
+        <w:pStyle w:val="heading20"/>
+      </w:pPr>
+      <w:r>
+        <w:t xml:space="preserve">Volatility Before </w:t>
+      </w:r>
+      <w:proofErr w:type="gramStart"/>
+      <w:r>
+        <w:t>vs</w:t>
+      </w:r>
+      <w:proofErr w:type="gramEnd"/>
+      <w:r>
+        <w:t xml:space="preserve"> After Each Devaluation</w:t>
+      </w:r>
+    </w:p>
+    <w:p>
+      <w:r>
+        <w:drawing>
+          <wp:inline distT="0" distB="0" distL="0" distR="0" wp14:anchorId="41B3388A" wp14:editId="7818D26E">
+            <wp:extent cx="5943600" cy="2054225"/>
+            <wp:effectExtent l="0" t="0" r="0" b="3175"/>
+            <wp:docPr id="4" name="Picture 4"/>
+            <wp:cNvGraphicFramePr>
+              <a:graphicFrameLocks xmlns:a="http://schemas.openxmlformats.org/drawingml/2006/main" noChangeAspect="1"/>
+            </wp:cNvGraphicFramePr>
+            <a:graphic xmlns:a="http://schemas.openxmlformats.org/drawingml/2006/main">
+              <a:graphicData uri="http://schemas.openxmlformats.org/drawingml/2006/picture">
+                <pic:pic xmlns:pic="http://schemas.openxmlformats.org/drawingml/2006/picture">
+                  <pic:nvPicPr>
+                    <pic:cNvPr id="1" name=""/>
+                    <pic:cNvPicPr/>
+                  </pic:nvPicPr>
+                  <pic:blipFill>
+                    <a:blip r:embed="rId17"/>
+                    <a:stretch>
+                      <a:fillRect/>
+                    </a:stretch>
+                  </pic:blipFill>
+                  <pic:spPr>
+                    <a:xfrm>
+                      <a:off x="0" y="0"/>
+                      <a:ext cx="5943600" cy="2054225"/>
+                    </a:xfrm>
+                    <a:prstGeom prst="rect">
+                      <a:avLst/>
+                    </a:prstGeom>
+                  </pic:spPr>
+                </pic:pic>
+              </a:graphicData>
+            </a:graphic>
+          </wp:inline>
+        </w:drawing>
+      </w:r>
+    </w:p>
+    <w:p>
+      <w:pPr>
+        <w:spacing w:before="120" w:after="200"/>
+      </w:pPr>
+      <w:r>
+        <w:rPr>
+          <w:b/>
+          <w:bCs/>
+          <w:sz w:val="20"/>
+          <w:szCs w:val="20"/>
+        </w:rPr>
+        <w:t>Chart</w:t>
+      </w:r>
+      <w:r>
+        <w:rPr>
+          <w:b/>
+          <w:bCs/>
+          <w:sz w:val="20"/>
+          <w:szCs w:val="20"/>
+        </w:rPr>
+        <w:t xml:space="preserve"> 8: Bar chart comparing volatility before and after each of the three devaluation events.</w:t>
+      </w:r>
+    </w:p>
+    <w:p>
+      <w:pPr>
+        <w:spacing w:after="200"/>
+      </w:pPr>
+      <w:r>
+        <w:t>Each devaluation event caused a clear spike in volatility across all stocks. The January 2024 devaluatio</w:t>
+      </w:r>
+      <w:r>
+        <w:t xml:space="preserve">n had the most dramatic </w:t>
+      </w:r>
+      <w:proofErr w:type="gramStart"/>
+      <w:r>
+        <w:t>effect ,</w:t>
+      </w:r>
+      <w:proofErr w:type="gramEnd"/>
+      <w:r>
+        <w:t xml:space="preserve"> it moved the EGP from around 30 to nearly 50 per dollar almost overnight, and the 30-day post window shows consistently higher volatility for every stock. The March and October 2022 events were more moderate but still statistically significant for most stocks. This confirms that macroeconomic shocks like currency devaluations</w:t>
+      </w:r>
+      <w:r>
+        <w:t xml:space="preserve"> do not just affect one </w:t>
+      </w:r>
+      <w:proofErr w:type="gramStart"/>
+      <w:r>
+        <w:t>sector ,</w:t>
+      </w:r>
+      <w:proofErr w:type="gramEnd"/>
+      <w:r>
+        <w:t xml:space="preserve"> they ripple across the entire market at once.</w:t>
+      </w:r>
+    </w:p>
+    <w:p>
+      <w:pPr>
+        <w:pStyle w:val="heading10"/>
+      </w:pPr>
+      <w:r>
+        <w:t>Predictive Model (Linear Regression)</w:t>
+      </w:r>
+    </w:p>
+    <w:p>
+      <w:pPr>
+        <w:spacing w:after="200"/>
+      </w:pPr>
+      <w:r>
+        <w:t>We built a simple linear regression model to predict the next day’s closing price usin</w:t>
+      </w:r>
+      <w:r>
+        <w:t xml:space="preserve">g six features: the last 3 </w:t>
+      </w:r>
+      <w:proofErr w:type="gramStart"/>
+      <w:r>
+        <w:t>days</w:t>
+      </w:r>
+      <w:proofErr w:type="gramEnd"/>
+      <w:r>
+        <w:t xml:space="preserve"> prices (lag1, lag2, lag3), a 5-day moving average, a 20-day moving average, and 5-day rolling volatility. We used an 80/20 train/test split (2021-2025 for training, 2026 for testing) and scaled all features with MinMaxScaler before fitting the model.</w:t>
+      </w:r>
+    </w:p>
+    <w:p>
+      <w:pPr>
+        <w:pStyle w:val="heading20"/>
+      </w:pPr>
+      <w:r>
+        <w:t>Actual vs Predicted Prices</w:t>
+      </w:r>
+    </w:p>
+    <w:p>
+      <w:r>
+        <w:drawing>
+          <wp:inline distT="0" distB="0" distL="0" distR="0" wp14:anchorId="56FD977B" wp14:editId="501B04F5">
+            <wp:extent cx="5943600" cy="821055"/>
+            <wp:effectExtent l="0" t="0" r="0" b="0"/>
+            <wp:docPr id="5" name="Picture 5"/>
+            <wp:cNvGraphicFramePr>
+              <a:graphicFrameLocks xmlns:a="http://schemas.openxmlformats.org/drawingml/2006/main" noChangeAspect="1"/>
+            </wp:cNvGraphicFramePr>
+            <a:graphic xmlns:a="http://schemas.openxmlformats.org/drawingml/2006/main">
+              <a:graphicData uri="http://schemas.openxmlformats.org/drawingml/2006/picture">
+                <pic:pic xmlns:pic="http://schemas.openxmlformats.org/drawingml/2006/picture">
+                  <pic:nvPicPr>
+                    <pic:cNvPr id="1" name=""/>
+                    <pic:cNvPicPr/>
+                  </pic:nvPicPr>
+                  <pic:blipFill>
+                    <a:blip r:embed="rId18"/>
+                    <a:stretch>
+                      <a:fillRect/>
+                    </a:stretch>
+                  </pic:blipFill>
+                  <pic:spPr>
+                    <a:xfrm>
+                      <a:off x="0" y="0"/>
+                      <a:ext cx="5943600" cy="821055"/>
+                    </a:xfrm>
+                    <a:prstGeom prst="rect">
+                      <a:avLst/>
+                    </a:prstGeom>
+                  </pic:spPr>
+                </pic:pic>
+              </a:graphicData>
+            </a:graphic>
+          </wp:inline>
+        </w:drawing>
+      </w:r>
+    </w:p>
+    <w:p>
+      <w:pPr>
+        <w:spacing w:before="120" w:after="200"/>
+      </w:pPr>
+      <w:r>
+        <w:rPr>
+          <w:b/>
+          <w:bCs/>
+          <w:sz w:val="20"/>
+          <w:szCs w:val="20"/>
+        </w:rPr>
+        <w:t>Chart</w:t>
+      </w:r>
+      <w:r>
+        <w:rPr>
+          <w:b/>
+          <w:bCs/>
+          <w:sz w:val="20"/>
+          <w:szCs w:val="20"/>
+        </w:rPr>
+        <w:t xml:space="preserve"> 9: Actual vs Predicted closing prices for the 5 stocks in the test set (2025-2026).</w:t>
+      </w:r>
+    </w:p>
+    <w:p>
+      <w:pPr>
+        <w:pStyle w:val="heading20"/>
+      </w:pPr>
+      <w:r>
+        <w:t>Model Performance (R2 and RMSE)</w:t>
+      </w:r>
+    </w:p>
+    <w:p>
+      <w:r>
+        <w:lastRenderedPageBreak/>
+        <w:drawing>
+          <wp:inline distT="0" distB="0" distL="0" distR="0" wp14:anchorId="40DE3EA2" wp14:editId="60DD0288">
+            <wp:extent cx="5608320" cy="1792146"/>
+            <wp:effectExtent l="0" t="0" r="0" b="0"/>
+            <wp:docPr id="6" name="Picture 6"/>
+            <wp:cNvGraphicFramePr>
+              <a:graphicFrameLocks xmlns:a="http://schemas.openxmlformats.org/drawingml/2006/main" noChangeAspect="1"/>
+            </wp:cNvGraphicFramePr>
+            <a:graphic xmlns:a="http://schemas.openxmlformats.org/drawingml/2006/main">
+              <a:graphicData uri="http://schemas.openxmlformats.org/drawingml/2006/picture">
+                <pic:pic xmlns:pic="http://schemas.openxmlformats.org/drawingml/2006/picture">
+                  <pic:nvPicPr>
+                    <pic:cNvPr id="1" name=""/>
+                    <pic:cNvPicPr/>
+                  </pic:nvPicPr>
+                  <pic:blipFill>
+                    <a:blip r:embed="rId19"/>
+                    <a:stretch>
+                      <a:fillRect/>
+                    </a:stretch>
+                  </pic:blipFill>
+                  <pic:spPr>
+                    <a:xfrm>
+                      <a:off x="0" y="0"/>
+                      <a:ext cx="5633517" cy="1800198"/>
+                    </a:xfrm>
+                    <a:prstGeom prst="rect">
+                      <a:avLst/>
+                    </a:prstGeom>
+                  </pic:spPr>
+                </pic:pic>
+              </a:graphicData>
+            </a:graphic>
+          </wp:inline>
+        </w:drawing>
+      </w:r>
+    </w:p>
+    <w:p>
+      <w:pPr>
+        <w:spacing w:before="120" w:after="200"/>
+      </w:pPr>
+      <w:r>
+        <w:rPr>
+          <w:b/>
+          <w:bCs/>
+          <w:sz w:val="20"/>
+          <w:szCs w:val="20"/>
+        </w:rPr>
+        <w:t>Chart</w:t>
+      </w:r>
+      <w:r>
+        <w:rPr>
+          <w:b/>
+          <w:bCs/>
+          <w:sz w:val="20"/>
+          <w:szCs w:val="20"/>
+        </w:rPr>
+        <w:t xml:space="preserve"> 10: R2 score and RMSE bar charts for the 5 stocks.</w:t>
+      </w:r>
+    </w:p>
+    <w:p>
+      <w:pPr>
+        <w:spacing w:after="200"/>
+      </w:pPr>
+      <w:r>
+        <w:t>The model achieves high R2 scores across all stocks, which initially looks impressive. However, this is expected - when you use yesterday’s price to predict today’s price, you are essentially tracking the trend rather than discovering anything hidden. The model is good at capturing direction in a trending market but it cannot predict sudden reversals caused by events like currency devaluations. The RMSE tells the more honest story: for higher-priced stocks like COMI and SWDY the prediction error in EGP terms is larger, even if the percentage error is similar. This model is a useful baseline, but real-world price prediction would need to account for news events, volume shocks, and non-linear relationships.</w:t>
       </w:r>
     </w:p>
     <w:p>
@@ -6655,7 +7046,7 @@
         <w:t xml:space="preserve">The growth is real. </w:t>
       </w:r>
       <w:r>
-        <w:t>8 out of 10 stocks passed the statistical test. Their prices going up over 5 years isn’t random noise — it’s a genuine trend.</w:t>
+        <w:t>8 out of 10 stocks passed the statistical test. Their prices going up over 5 years isn’t random noise - it’s a genuine trend.</w:t>
       </w:r>
     </w:p>
     <w:p>
@@ -6702,8 +7093,7 @@
         <w:spacing w:after="200"/>
       </w:pPr>
       <w:r>
-        <w:lastRenderedPageBreak/>
-        <w:t>In simple terms: investing in Egyptian stocks during this period wasn’t gambling — there were real, measurable upward trends. But the market behaves as one big system, so picking different sectors doesn’t give you much variety.</w:t>
+        <w:t>In simple terms: investing in Egyptian stocks during this period wasn’t gambling - there were real, measurable upward trends. But the market behaves as one big system, so picking different sectors doesn’t give you much variety.</w:t>
       </w:r>
     </w:p>
     <w:p>
@@ -6746,13 +7136,11 @@
           <w:b/>
           <w:bCs/>
         </w:rPr>
+        <w:lastRenderedPageBreak/>
         <w:t xml:space="preserve">Inflation not accounted for: </w:t>
       </w:r>
       <w:r>
-        <w:t>Stock prices went up in Egyptian pounds, but the pound itself lost a lot of value. In r</w:t>
-      </w:r>
-      <w:r>
-        <w:t>eal purchasing power, the gains might be smaller than they appear.</w:t>
+        <w:t>Stock prices went up in Egyptian pounds, but the pound itself lost a lot of value. In real purchasing power, the gains might be smaller than they appear.</w:t>
       </w:r>
     </w:p>
     <w:p>
@@ -6810,12 +7198,17 @@
         <w:t xml:space="preserve">No external data: </w:t>
       </w:r>
       <w:r>
-        <w:t>We didn’t include the USD/EGP exchange rate, inflation numbers, or Central Bank decisions in our analysis. Adding these could help explain why the market moved the way it did.</w:t>
+        <w:t xml:space="preserve">We didn’t include the USD/EGP exchange rate, inflation numbers, or Central Bank decisions in our analysis. Adding these could help explain why the market moved the </w:t>
+      </w:r>
+      <w:bookmarkStart w:id="0" w:name="_GoBack"/>
+      <w:bookmarkEnd w:id="0"/>
+      <w:r>
+        <w:t>way it did.</w:t>
       </w:r>
     </w:p>
     <w:sectPr>
-      <w:headerReference w:type="default" r:id="rId15"/>
-      <w:footerReference w:type="default" r:id="rId16"/>
+      <w:headerReference w:type="default" r:id="rId20"/>
+      <w:footerReference w:type="default" r:id="rId21"/>
       <w:pgSz w:w="12240" w:h="15840"/>
       <w:pgMar w:top="1440" w:right="1440" w:bottom="1440" w:left="1440" w:header="708" w:footer="708" w:gutter="0"/>
       <w:cols w:space="720"/>
@@ -6910,55 +7303,6 @@
     <w:pPr>
       <w:jc w:val="center"/>
     </w:pPr>
-    <w:r>
-      <w:rPr>
-        <w:color w:val="999999"/>
-        <w:sz w:val="16"/>
-        <w:szCs w:val="16"/>
-      </w:rPr>
-      <w:t xml:space="preserve">Page </w:t>
-    </w:r>
-    <w:r>
-      <w:rPr>
-        <w:color w:val="999999"/>
-        <w:sz w:val="16"/>
-        <w:szCs w:val="16"/>
-      </w:rPr>
-      <w:fldChar w:fldCharType="begin"/>
-    </w:r>
-    <w:r>
-      <w:rPr>
-        <w:color w:val="999999"/>
-        <w:sz w:val="16"/>
-        <w:szCs w:val="16"/>
-      </w:rPr>
-      <w:instrText>PAGE</w:instrText>
-    </w:r>
-    <w:r>
-      <w:rPr>
-        <w:color w:val="999999"/>
-        <w:sz w:val="16"/>
-        <w:szCs w:val="16"/>
-      </w:rPr>
-      <w:fldChar w:fldCharType="separate"/>
-    </w:r>
-    <w:r>
-      <w:rPr>
-        <w:noProof/>
-        <w:color w:val="999999"/>
-        <w:sz w:val="16"/>
-        <w:szCs w:val="16"/>
-      </w:rPr>
-      <w:t>2</w:t>
-    </w:r>
-    <w:r>
-      <w:rPr>
-        <w:color w:val="999999"/>
-        <w:sz w:val="16"/>
-        <w:szCs w:val="16"/>
-      </w:rPr>
-      <w:fldChar w:fldCharType="end"/>
-    </w:r>
   </w:p>
 </w:ftr>
 </file>
@@ -7048,16 +7392,6 @@
     <w:pPr>
       <w:jc w:val="right"/>
     </w:pPr>
-    <w:r>
-      <w:rPr>
-        <w:i/>
-        <w:iCs/>
-        <w:color w:val="999999"/>
-        <w:sz w:val="16"/>
-        <w:szCs w:val="16"/>
-      </w:rPr>
-      <w:t>EGX30 Stock Analysis — C-DE211 Project 3</w:t>
-    </w:r>
   </w:p>
 </w:hdr>
 </file>
@@ -7214,7 +7548,7 @@
       <w:lvlText w:val="•"/>
       <w:lvlJc w:val="left"/>
       <w:pPr>
-        <w:ind w:left="720" w:hanging="360"/>
+        <w:ind w:left="360" w:hanging="360"/>
       </w:pPr>
     </w:lvl>
     <w:lvl w:ilvl="1" w:tplc="745EAEC4">

</xml_diff>

<commit_message>
Removed an unimportant section
</commit_message>
<xml_diff>
--- a/EGX30_Report.docx
+++ b/EGX30_Report.docx
@@ -1,6 +1,6 @@
 
 <file path=word/document.xml><?xml version="1.0" encoding="utf-8"?>
-<w:document xmlns:wpc="http://schemas.microsoft.com/office/word/2010/wordprocessingCanvas" xmlns:cx="http://schemas.microsoft.com/office/drawing/2014/chartex" xmlns:mc="http://schemas.openxmlformats.org/markup-compatibility/2006" xmlns:o="urn:schemas-microsoft-com:office:office" xmlns:r="http://schemas.openxmlformats.org/officeDocument/2006/relationships" xmlns:m="http://schemas.openxmlformats.org/officeDocument/2006/math" xmlns:v="urn:schemas-microsoft-com:vml" xmlns:wp14="http://schemas.microsoft.com/office/word/2010/wordprocessingDrawing" xmlns:wp="http://schemas.openxmlformats.org/drawingml/2006/wordprocessingDrawing" xmlns:w10="urn:schemas-microsoft-com:office:word" xmlns:w="http://schemas.openxmlformats.org/wordprocessingml/2006/main" xmlns:w14="http://schemas.microsoft.com/office/word/2010/wordml" xmlns:w15="http://schemas.microsoft.com/office/word/2012/wordml" xmlns:w16se="http://schemas.microsoft.com/office/word/2015/wordml/symex" xmlns:wpg="http://schemas.microsoft.com/office/word/2010/wordprocessingGroup" xmlns:wpi="http://schemas.microsoft.com/office/word/2010/wordprocessingInk" xmlns:wne="http://schemas.microsoft.com/office/word/2006/wordml" xmlns:wps="http://schemas.microsoft.com/office/word/2010/wordprocessingShape" mc:Ignorable="w14 w15 w16se wp14">
+<w:document xmlns:wpc="http://schemas.microsoft.com/office/word/2010/wordprocessingCanvas" xmlns:cx="http://schemas.microsoft.com/office/drawing/2014/chartex" xmlns:cx1="http://schemas.microsoft.com/office/drawing/2015/9/8/chartex" xmlns:cx2="http://schemas.microsoft.com/office/drawing/2015/10/21/chartex" xmlns:cx3="http://schemas.microsoft.com/office/drawing/2016/5/9/chartex" xmlns:cx4="http://schemas.microsoft.com/office/drawing/2016/5/10/chartex" xmlns:cx5="http://schemas.microsoft.com/office/drawing/2016/5/11/chartex" xmlns:cx6="http://schemas.microsoft.com/office/drawing/2016/5/12/chartex" xmlns:cx7="http://schemas.microsoft.com/office/drawing/2016/5/13/chartex" xmlns:cx8="http://schemas.microsoft.com/office/drawing/2016/5/14/chartex" xmlns:mc="http://schemas.openxmlformats.org/markup-compatibility/2006" xmlns:aink="http://schemas.microsoft.com/office/drawing/2016/ink" xmlns:am3d="http://schemas.microsoft.com/office/drawing/2017/model3d" xmlns:o="urn:schemas-microsoft-com:office:office" xmlns:oel="http://schemas.microsoft.com/office/2019/extlst" xmlns:r="http://schemas.openxmlformats.org/officeDocument/2006/relationships" xmlns:m="http://schemas.openxmlformats.org/officeDocument/2006/math" xmlns:v="urn:schemas-microsoft-com:vml" xmlns:wp14="http://schemas.microsoft.com/office/word/2010/wordprocessingDrawing" xmlns:wp="http://schemas.openxmlformats.org/drawingml/2006/wordprocessingDrawing" xmlns:w10="urn:schemas-microsoft-com:office:word" xmlns:w="http://schemas.openxmlformats.org/wordprocessingml/2006/main" xmlns:w14="http://schemas.microsoft.com/office/word/2010/wordml" xmlns:w15="http://schemas.microsoft.com/office/word/2012/wordml" xmlns:w16cex="http://schemas.microsoft.com/office/word/2018/wordml/cex" xmlns:w16cid="http://schemas.microsoft.com/office/word/2016/wordml/cid" xmlns:w16="http://schemas.microsoft.com/office/word/2018/wordml" xmlns:w16du="http://schemas.microsoft.com/office/word/2023/wordml/word16du" xmlns:w16sdtdh="http://schemas.microsoft.com/office/word/2020/wordml/sdtdatahash" xmlns:w16sdtfl="http://schemas.microsoft.com/office/word/2024/wordml/sdtformatlock" xmlns:w16se="http://schemas.microsoft.com/office/word/2015/wordml/symex" xmlns:wpg="http://schemas.microsoft.com/office/word/2010/wordprocessingGroup" xmlns:wpi="http://schemas.microsoft.com/office/word/2010/wordprocessingInk" xmlns:wne="http://schemas.microsoft.com/office/word/2006/wordml" xmlns:wps="http://schemas.microsoft.com/office/word/2010/wordprocessingShape" mc:Ignorable="w14 w15 w16se w16cid w16 w16cex w16sdtdh w16sdtfl w16du wp14">
   <w:body>
     <w:p>
       <w:pPr>
@@ -164,7 +164,18 @@
           <w:sz w:val="60"/>
           <w:szCs w:val="60"/>
         </w:rPr>
-        <w:t>Predictive Analysis of EGX30</w:t>
+        <w:t xml:space="preserve">Data </w:t>
+      </w:r>
+      <w:r>
+        <w:rPr>
+          <w:rFonts w:asciiTheme="majorBidi" w:hAnsiTheme="majorBidi" w:cstheme="majorBidi"/>
+          <w:b/>
+          <w:bCs/>
+          <w:color w:val="0A1628"/>
+          <w:sz w:val="60"/>
+          <w:szCs w:val="60"/>
+        </w:rPr>
+        <w:t>Analysis of EGX30</w:t>
       </w:r>
     </w:p>
     <w:p>
@@ -595,15 +606,7 @@
         <w:spacing w:after="200"/>
       </w:pPr>
       <w:r>
-        <w:t xml:space="preserve">Between 2021 and 2026, Egypt went through major economic changes: </w:t>
-      </w:r>
-      <w:proofErr w:type="gramStart"/>
-      <w:r>
-        <w:t>the</w:t>
-      </w:r>
-      <w:proofErr w:type="gramEnd"/>
-      <w:r>
-        <w:t xml:space="preserve"> Egyptian pound lost a lot of its value, inflation went up, and the Central Bank kept adjusting interest rates. All of this raises a simple question: are Egyptian stocks actually growing, or are the price changes just random noise?</w:t>
+        <w:t>Between 2021 and 2026, Egypt went through major economic changes: the Egyptian pound lost a lot of its value, inflation went up, and the Central Bank kept adjusting interest rates. All of this raises a simple question: are Egyptian stocks actually growing, or are the price changes just random noise?</w:t>
       </w:r>
     </w:p>
     <w:p>
@@ -3679,6 +3682,9 @@
         <w:jc w:val="center"/>
       </w:pPr>
       <w:r>
+        <w:rPr>
+          <w:noProof/>
+        </w:rPr>
         <w:drawing>
           <wp:inline distT="0" distB="0" distL="0" distR="0" wp14:anchorId="1D9E64BF" wp14:editId="23A144B4">
             <wp:extent cx="5943600" cy="2096770"/>
@@ -3773,6 +3779,9 @@
         <w:jc w:val="center"/>
       </w:pPr>
       <w:r>
+        <w:rPr>
+          <w:noProof/>
+        </w:rPr>
         <w:drawing>
           <wp:inline distT="0" distB="0" distL="0" distR="0" wp14:anchorId="5E1A8F56" wp14:editId="5D8295C8">
             <wp:extent cx="5943600" cy="2096770"/>
@@ -3858,6 +3867,9 @@
         <w:jc w:val="center"/>
       </w:pPr>
       <w:r>
+        <w:rPr>
+          <w:noProof/>
+        </w:rPr>
         <w:drawing>
           <wp:inline distT="0" distB="0" distL="0" distR="0" wp14:anchorId="026742D3" wp14:editId="0C51976E">
             <wp:extent cx="4089400" cy="3530603"/>
@@ -3899,7 +3911,6 @@
       <w:pPr>
         <w:spacing w:before="120" w:after="200"/>
       </w:pPr>
-      <w:proofErr w:type="spellStart"/>
       <w:r>
         <w:rPr>
           <w:b/>
@@ -3909,7 +3920,6 @@
         </w:rPr>
         <w:t>Heatmap</w:t>
       </w:r>
-      <w:proofErr w:type="spellEnd"/>
       <w:r>
         <w:rPr>
           <w:b/>
@@ -3917,27 +3927,7 @@
           <w:sz w:val="20"/>
           <w:szCs w:val="20"/>
         </w:rPr>
-        <w:t xml:space="preserve"> 3: Correlation </w:t>
-      </w:r>
-      <w:proofErr w:type="spellStart"/>
-      <w:r>
-        <w:rPr>
-          <w:b/>
-          <w:bCs/>
-          <w:sz w:val="20"/>
-          <w:szCs w:val="20"/>
-        </w:rPr>
-        <w:t>heatmap</w:t>
-      </w:r>
-      <w:proofErr w:type="spellEnd"/>
-      <w:r>
-        <w:rPr>
-          <w:b/>
-          <w:bCs/>
-          <w:sz w:val="20"/>
-          <w:szCs w:val="20"/>
-        </w:rPr>
-        <w:t xml:space="preserve"> showing how similarly each pair of stocks moves.</w:t>
+        <w:t xml:space="preserve"> 3: Correlation heatmap showing how similarly each pair of stocks moves.</w:t>
       </w:r>
     </w:p>
     <w:p>
@@ -3964,13 +3954,8 @@
         <w:t>0.40 range, meaning stocks tend to move in the same general direction but not in lockstep. CANA (Suez Canal Bank)</w:t>
       </w:r>
       <w:r>
-        <w:t xml:space="preserve"> is the most independent </w:t>
-      </w:r>
-      <w:proofErr w:type="gramStart"/>
-      <w:r>
-        <w:t>stock ,</w:t>
-      </w:r>
-      <w:proofErr w:type="gramEnd"/>
+        <w:t xml:space="preserve"> is the most independent stock ,</w:t>
+      </w:r>
       <w:r>
         <w:t xml:space="preserve"> it barely correlates with anything else.</w:t>
       </w:r>
@@ -3988,6 +3973,9 @@
         <w:jc w:val="center"/>
       </w:pPr>
       <w:r>
+        <w:rPr>
+          <w:noProof/>
+        </w:rPr>
         <w:drawing>
           <wp:inline distT="0" distB="0" distL="0" distR="0" wp14:anchorId="1864DFCC" wp14:editId="15552630">
             <wp:extent cx="5943600" cy="2096770"/>
@@ -4084,6 +4072,9 @@
         <w:jc w:val="center"/>
       </w:pPr>
       <w:r>
+        <w:rPr>
+          <w:noProof/>
+        </w:rPr>
         <w:drawing>
           <wp:inline distT="0" distB="0" distL="0" distR="0" wp14:anchorId="26E1890E" wp14:editId="4EAB9864">
             <wp:extent cx="5943600" cy="2096770"/>
@@ -5895,6 +5886,7 @@
           <w:b/>
           <w:bCs/>
         </w:rPr>
+        <w:lastRenderedPageBreak/>
         <w:t xml:space="preserve">What we’re testing: </w:t>
       </w:r>
       <w:r>
@@ -5910,7 +5902,6 @@
           <w:b/>
           <w:bCs/>
         </w:rPr>
-        <w:lastRenderedPageBreak/>
         <w:t>Step 1 - Hypotheses:</w:t>
       </w:r>
     </w:p>
@@ -6440,15 +6431,7 @@
         <w:t xml:space="preserve">Yes, </w:t>
       </w:r>
       <w:r>
-        <w:t xml:space="preserve">stocks are genuinely going </w:t>
-      </w:r>
-      <w:proofErr w:type="gramStart"/>
-      <w:r>
-        <w:t>up ,</w:t>
-      </w:r>
-      <w:proofErr w:type="gramEnd"/>
-      <w:r>
-        <w:t xml:space="preserve"> it’s not random.</w:t>
+        <w:t>stocks are genuinely going up , it’s not random.</w:t>
       </w:r>
     </w:p>
     <w:p>
@@ -6520,6 +6503,9 @@
     </w:p>
     <w:p>
       <w:r>
+        <w:rPr>
+          <w:noProof/>
+        </w:rPr>
         <w:lastRenderedPageBreak/>
         <w:drawing>
           <wp:inline distT="0" distB="0" distL="0" distR="0" wp14:anchorId="18E14D31" wp14:editId="789D97D9">
@@ -6586,24 +6572,11 @@
         <w:spacing w:after="200"/>
       </w:pPr>
       <w:r>
-        <w:t xml:space="preserve">The Risk </w:t>
-      </w:r>
-      <w:proofErr w:type="gramStart"/>
-      <w:r>
-        <w:t>vs</w:t>
-      </w:r>
-      <w:proofErr w:type="gramEnd"/>
-      <w:r>
-        <w:t xml:space="preserve"> Return scatter shows that higher returns came with higher volatility across all 10 stocks. SWDY and TMGH sit in the upper-right, meaning they delivered the strongest gains but with the most daily swings. COMI and CIEB cluster near the lower-left, reflecting the more stable nature of established banks. Most stocks have skewness above zero, meaning occasional very large positive days are more common than large negative ones. The kurtosis values above 3 for </w:t>
-      </w:r>
-      <w:r>
-        <w:t xml:space="preserve">most stocks indicate fat </w:t>
-      </w:r>
-      <w:proofErr w:type="gramStart"/>
-      <w:r>
-        <w:t>tails ,</w:t>
-      </w:r>
-      <w:proofErr w:type="gramEnd"/>
+        <w:t xml:space="preserve">The Risk vs Return scatter shows that higher returns came with higher volatility across all 10 stocks. SWDY and TMGH sit in the upper-right, meaning they delivered the strongest gains but with the most daily swings. COMI and CIEB cluster near the lower-left, reflecting the more stable nature of established banks. Most stocks have skewness above zero, meaning occasional very large positive days are more common than large negative ones. The kurtosis values above 3 for </w:t>
+      </w:r>
+      <w:r>
+        <w:t>most stocks indicate fat tails ,</w:t>
+      </w:r>
       <w:r>
         <w:t xml:space="preserve"> extreme days happen more often than a normal distribution would predict, which is typical in emerging markets like Egypt.</w:t>
       </w:r>
@@ -6645,15 +6618,7 @@
         <w:t xml:space="preserve">r USD), and January 2024 (from 30 to </w:t>
       </w:r>
       <w:r>
-        <w:t xml:space="preserve">50 per </w:t>
-      </w:r>
-      <w:proofErr w:type="gramStart"/>
-      <w:r>
-        <w:t>USD ,</w:t>
-      </w:r>
-      <w:proofErr w:type="gramEnd"/>
-      <w:r>
-        <w:t xml:space="preserve"> </w:t>
+        <w:t xml:space="preserve">50 per USD , </w:t>
       </w:r>
       <w:r>
         <w:t>the biggest one). We studied whether these events caused measurable spikes in market volatility by comparing the 30-day windows before and after each event.</w:t>
@@ -6669,6 +6634,9 @@
     </w:p>
     <w:p>
       <w:r>
+        <w:rPr>
+          <w:noProof/>
+        </w:rPr>
         <w:drawing>
           <wp:inline distT="0" distB="0" distL="0" distR="0" wp14:anchorId="26B54B66" wp14:editId="621FEF6A">
             <wp:extent cx="5588000" cy="1971322"/>
@@ -6735,19 +6703,14 @@
         <w:pStyle w:val="heading20"/>
       </w:pPr>
       <w:r>
-        <w:t xml:space="preserve">Volatility Before </w:t>
-      </w:r>
-      <w:proofErr w:type="gramStart"/>
-      <w:r>
-        <w:t>vs</w:t>
-      </w:r>
-      <w:proofErr w:type="gramEnd"/>
-      <w:r>
-        <w:t xml:space="preserve"> After Each Devaluation</w:t>
-      </w:r>
-    </w:p>
-    <w:p>
-      <w:r>
+        <w:t>Volatility Before vs After Each Devaluation</w:t>
+      </w:r>
+    </w:p>
+    <w:p>
+      <w:r>
+        <w:rPr>
+          <w:noProof/>
+        </w:rPr>
         <w:drawing>
           <wp:inline distT="0" distB="0" distL="0" distR="0" wp14:anchorId="41B3388A" wp14:editId="7818D26E">
             <wp:extent cx="5943600" cy="2054225"/>
@@ -6816,202 +6779,16 @@
         <w:t>Each devaluation event caused a clear spike in volatility across all stocks. The January 2024 devaluatio</w:t>
       </w:r>
       <w:r>
-        <w:t xml:space="preserve">n had the most dramatic </w:t>
-      </w:r>
-      <w:proofErr w:type="gramStart"/>
-      <w:r>
-        <w:t>effect ,</w:t>
-      </w:r>
-      <w:proofErr w:type="gramEnd"/>
+        <w:t>n had the most dramatic effect ,</w:t>
+      </w:r>
       <w:r>
         <w:t xml:space="preserve"> it moved the EGP from around 30 to nearly 50 per dollar almost overnight, and the 30-day post window shows consistently higher volatility for every stock. The March and October 2022 events were more moderate but still statistically significant for most stocks. This confirms that macroeconomic shocks like currency devaluations</w:t>
       </w:r>
       <w:r>
-        <w:t xml:space="preserve"> do not just affect one </w:t>
-      </w:r>
-      <w:proofErr w:type="gramStart"/>
-      <w:r>
-        <w:t>sector ,</w:t>
-      </w:r>
-      <w:proofErr w:type="gramEnd"/>
+        <w:t xml:space="preserve"> do not just affect one sector ,</w:t>
+      </w:r>
       <w:r>
         <w:t xml:space="preserve"> they ripple across the entire market at once.</w:t>
-      </w:r>
-    </w:p>
-    <w:p>
-      <w:pPr>
-        <w:pStyle w:val="heading10"/>
-      </w:pPr>
-      <w:r>
-        <w:t>Predictive Model (Linear Regression)</w:t>
-      </w:r>
-    </w:p>
-    <w:p>
-      <w:pPr>
-        <w:spacing w:after="200"/>
-      </w:pPr>
-      <w:r>
-        <w:t>We built a simple linear regression model to predict the next day’s closing price usin</w:t>
-      </w:r>
-      <w:r>
-        <w:t xml:space="preserve">g six features: the last 3 </w:t>
-      </w:r>
-      <w:proofErr w:type="gramStart"/>
-      <w:r>
-        <w:t>days</w:t>
-      </w:r>
-      <w:proofErr w:type="gramEnd"/>
-      <w:r>
-        <w:t xml:space="preserve"> prices (lag1, lag2, lag3), a 5-day moving average, a 20-day moving average, and 5-day rolling volatility. We used an 80/20 train/test split (2021-2025 for training, 2026 for testing) and scaled all features with MinMaxScaler before fitting the model.</w:t>
-      </w:r>
-    </w:p>
-    <w:p>
-      <w:pPr>
-        <w:pStyle w:val="heading20"/>
-      </w:pPr>
-      <w:r>
-        <w:t>Actual vs Predicted Prices</w:t>
-      </w:r>
-    </w:p>
-    <w:p>
-      <w:r>
-        <w:drawing>
-          <wp:inline distT="0" distB="0" distL="0" distR="0" wp14:anchorId="56FD977B" wp14:editId="501B04F5">
-            <wp:extent cx="5943600" cy="821055"/>
-            <wp:effectExtent l="0" t="0" r="0" b="0"/>
-            <wp:docPr id="5" name="Picture 5"/>
-            <wp:cNvGraphicFramePr>
-              <a:graphicFrameLocks xmlns:a="http://schemas.openxmlformats.org/drawingml/2006/main" noChangeAspect="1"/>
-            </wp:cNvGraphicFramePr>
-            <a:graphic xmlns:a="http://schemas.openxmlformats.org/drawingml/2006/main">
-              <a:graphicData uri="http://schemas.openxmlformats.org/drawingml/2006/picture">
-                <pic:pic xmlns:pic="http://schemas.openxmlformats.org/drawingml/2006/picture">
-                  <pic:nvPicPr>
-                    <pic:cNvPr id="1" name=""/>
-                    <pic:cNvPicPr/>
-                  </pic:nvPicPr>
-                  <pic:blipFill>
-                    <a:blip r:embed="rId18"/>
-                    <a:stretch>
-                      <a:fillRect/>
-                    </a:stretch>
-                  </pic:blipFill>
-                  <pic:spPr>
-                    <a:xfrm>
-                      <a:off x="0" y="0"/>
-                      <a:ext cx="5943600" cy="821055"/>
-                    </a:xfrm>
-                    <a:prstGeom prst="rect">
-                      <a:avLst/>
-                    </a:prstGeom>
-                  </pic:spPr>
-                </pic:pic>
-              </a:graphicData>
-            </a:graphic>
-          </wp:inline>
-        </w:drawing>
-      </w:r>
-    </w:p>
-    <w:p>
-      <w:pPr>
-        <w:spacing w:before="120" w:after="200"/>
-      </w:pPr>
-      <w:r>
-        <w:rPr>
-          <w:b/>
-          <w:bCs/>
-          <w:sz w:val="20"/>
-          <w:szCs w:val="20"/>
-        </w:rPr>
-        <w:t>Chart</w:t>
-      </w:r>
-      <w:r>
-        <w:rPr>
-          <w:b/>
-          <w:bCs/>
-          <w:sz w:val="20"/>
-          <w:szCs w:val="20"/>
-        </w:rPr>
-        <w:t xml:space="preserve"> 9: Actual vs Predicted closing prices for the 5 stocks in the test set (2025-2026).</w:t>
-      </w:r>
-    </w:p>
-    <w:p>
-      <w:pPr>
-        <w:pStyle w:val="heading20"/>
-      </w:pPr>
-      <w:r>
-        <w:t>Model Performance (R2 and RMSE)</w:t>
-      </w:r>
-    </w:p>
-    <w:p>
-      <w:r>
-        <w:lastRenderedPageBreak/>
-        <w:drawing>
-          <wp:inline distT="0" distB="0" distL="0" distR="0" wp14:anchorId="40DE3EA2" wp14:editId="60DD0288">
-            <wp:extent cx="5608320" cy="1792146"/>
-            <wp:effectExtent l="0" t="0" r="0" b="0"/>
-            <wp:docPr id="6" name="Picture 6"/>
-            <wp:cNvGraphicFramePr>
-              <a:graphicFrameLocks xmlns:a="http://schemas.openxmlformats.org/drawingml/2006/main" noChangeAspect="1"/>
-            </wp:cNvGraphicFramePr>
-            <a:graphic xmlns:a="http://schemas.openxmlformats.org/drawingml/2006/main">
-              <a:graphicData uri="http://schemas.openxmlformats.org/drawingml/2006/picture">
-                <pic:pic xmlns:pic="http://schemas.openxmlformats.org/drawingml/2006/picture">
-                  <pic:nvPicPr>
-                    <pic:cNvPr id="1" name=""/>
-                    <pic:cNvPicPr/>
-                  </pic:nvPicPr>
-                  <pic:blipFill>
-                    <a:blip r:embed="rId19"/>
-                    <a:stretch>
-                      <a:fillRect/>
-                    </a:stretch>
-                  </pic:blipFill>
-                  <pic:spPr>
-                    <a:xfrm>
-                      <a:off x="0" y="0"/>
-                      <a:ext cx="5633517" cy="1800198"/>
-                    </a:xfrm>
-                    <a:prstGeom prst="rect">
-                      <a:avLst/>
-                    </a:prstGeom>
-                  </pic:spPr>
-                </pic:pic>
-              </a:graphicData>
-            </a:graphic>
-          </wp:inline>
-        </w:drawing>
-      </w:r>
-    </w:p>
-    <w:p>
-      <w:pPr>
-        <w:spacing w:before="120" w:after="200"/>
-      </w:pPr>
-      <w:r>
-        <w:rPr>
-          <w:b/>
-          <w:bCs/>
-          <w:sz w:val="20"/>
-          <w:szCs w:val="20"/>
-        </w:rPr>
-        <w:t>Chart</w:t>
-      </w:r>
-      <w:r>
-        <w:rPr>
-          <w:b/>
-          <w:bCs/>
-          <w:sz w:val="20"/>
-          <w:szCs w:val="20"/>
-        </w:rPr>
-        <w:t xml:space="preserve"> 10: R2 score and RMSE bar charts for the 5 stocks.</w:t>
-      </w:r>
-    </w:p>
-    <w:p>
-      <w:pPr>
-        <w:spacing w:after="200"/>
-      </w:pPr>
-      <w:r>
-        <w:t>The model achieves high R2 scores across all stocks, which initially looks impressive. However, this is expected - when you use yesterday’s price to predict today’s price, you are essentially tracking the trend rather than discovering anything hidden. The model is good at capturing direction in a trending market but it cannot predict sudden reversals caused by events like currency devaluations. The RMSE tells the more honest story: for higher-priced stocks like COMI and SWDY the prediction error in EGP terms is larger, even if the percentage error is similar. This model is a useful baseline, but real-world price prediction would need to account for news events, volume shocks, and non-linear relationships.</w:t>
       </w:r>
     </w:p>
     <w:p>
@@ -7117,6 +6894,7 @@
           <w:b/>
           <w:bCs/>
         </w:rPr>
+        <w:lastRenderedPageBreak/>
         <w:t xml:space="preserve">Survivorship Bias: </w:t>
       </w:r>
       <w:r>
@@ -7136,7 +6914,6 @@
           <w:b/>
           <w:bCs/>
         </w:rPr>
-        <w:lastRenderedPageBreak/>
         <w:t xml:space="preserve">Inflation not accounted for: </w:t>
       </w:r>
       <w:r>
@@ -7198,17 +6975,12 @@
         <w:t xml:space="preserve">No external data: </w:t>
       </w:r>
       <w:r>
-        <w:t xml:space="preserve">We didn’t include the USD/EGP exchange rate, inflation numbers, or Central Bank decisions in our analysis. Adding these could help explain why the market moved the </w:t>
-      </w:r>
-      <w:bookmarkStart w:id="0" w:name="_GoBack"/>
-      <w:bookmarkEnd w:id="0"/>
-      <w:r>
-        <w:t>way it did.</w:t>
+        <w:t>We didn’t include the USD/EGP exchange rate, inflation numbers, or Central Bank decisions in our analysis. Adding these could help explain why the market moved the way it did.</w:t>
       </w:r>
     </w:p>
     <w:sectPr>
-      <w:headerReference w:type="default" r:id="rId20"/>
-      <w:footerReference w:type="default" r:id="rId21"/>
+      <w:headerReference w:type="default" r:id="rId18"/>
+      <w:footerReference w:type="default" r:id="rId19"/>
       <w:pgSz w:w="12240" w:h="15840"/>
       <w:pgMar w:top="1440" w:right="1440" w:bottom="1440" w:left="1440" w:header="708" w:footer="708" w:gutter="0"/>
       <w:cols w:space="720"/>
@@ -7219,7 +6991,7 @@
 </file>
 
 <file path=word/endnotes.xml><?xml version="1.0" encoding="utf-8"?>
-<w:endnotes xmlns:wpc="http://schemas.microsoft.com/office/word/2010/wordprocessingCanvas" xmlns:cx="http://schemas.microsoft.com/office/drawing/2014/chartex" xmlns:mc="http://schemas.openxmlformats.org/markup-compatibility/2006" xmlns:o="urn:schemas-microsoft-com:office:office" xmlns:r="http://schemas.openxmlformats.org/officeDocument/2006/relationships" xmlns:m="http://schemas.openxmlformats.org/officeDocument/2006/math" xmlns:v="urn:schemas-microsoft-com:vml" xmlns:wp14="http://schemas.microsoft.com/office/word/2010/wordprocessingDrawing" xmlns:wp="http://schemas.openxmlformats.org/drawingml/2006/wordprocessingDrawing" xmlns:w10="urn:schemas-microsoft-com:office:word" xmlns:w="http://schemas.openxmlformats.org/wordprocessingml/2006/main" xmlns:w14="http://schemas.microsoft.com/office/word/2010/wordml" xmlns:w15="http://schemas.microsoft.com/office/word/2012/wordml" xmlns:w16se="http://schemas.microsoft.com/office/word/2015/wordml/symex" xmlns:wpg="http://schemas.microsoft.com/office/word/2010/wordprocessingGroup" xmlns:wpi="http://schemas.microsoft.com/office/word/2010/wordprocessingInk" xmlns:wne="http://schemas.microsoft.com/office/word/2006/wordml" xmlns:wps="http://schemas.microsoft.com/office/word/2010/wordprocessingShape" mc:Ignorable="w14 w15 w16se wp14">
+<w:endnotes xmlns:wpc="http://schemas.microsoft.com/office/word/2010/wordprocessingCanvas" xmlns:cx="http://schemas.microsoft.com/office/drawing/2014/chartex" xmlns:cx1="http://schemas.microsoft.com/office/drawing/2015/9/8/chartex" xmlns:cx2="http://schemas.microsoft.com/office/drawing/2015/10/21/chartex" xmlns:cx3="http://schemas.microsoft.com/office/drawing/2016/5/9/chartex" xmlns:cx4="http://schemas.microsoft.com/office/drawing/2016/5/10/chartex" xmlns:cx5="http://schemas.microsoft.com/office/drawing/2016/5/11/chartex" xmlns:cx6="http://schemas.microsoft.com/office/drawing/2016/5/12/chartex" xmlns:cx7="http://schemas.microsoft.com/office/drawing/2016/5/13/chartex" xmlns:cx8="http://schemas.microsoft.com/office/drawing/2016/5/14/chartex" xmlns:mc="http://schemas.openxmlformats.org/markup-compatibility/2006" xmlns:aink="http://schemas.microsoft.com/office/drawing/2016/ink" xmlns:am3d="http://schemas.microsoft.com/office/drawing/2017/model3d" xmlns:o="urn:schemas-microsoft-com:office:office" xmlns:oel="http://schemas.microsoft.com/office/2019/extlst" xmlns:r="http://schemas.openxmlformats.org/officeDocument/2006/relationships" xmlns:m="http://schemas.openxmlformats.org/officeDocument/2006/math" xmlns:v="urn:schemas-microsoft-com:vml" xmlns:wp14="http://schemas.microsoft.com/office/word/2010/wordprocessingDrawing" xmlns:wp="http://schemas.openxmlformats.org/drawingml/2006/wordprocessingDrawing" xmlns:w10="urn:schemas-microsoft-com:office:word" xmlns:w="http://schemas.openxmlformats.org/wordprocessingml/2006/main" xmlns:w14="http://schemas.microsoft.com/office/word/2010/wordml" xmlns:w15="http://schemas.microsoft.com/office/word/2012/wordml" xmlns:w16cex="http://schemas.microsoft.com/office/word/2018/wordml/cex" xmlns:w16cid="http://schemas.microsoft.com/office/word/2016/wordml/cid" xmlns:w16="http://schemas.microsoft.com/office/word/2018/wordml" xmlns:w16du="http://schemas.microsoft.com/office/word/2023/wordml/word16du" xmlns:w16sdtdh="http://schemas.microsoft.com/office/word/2020/wordml/sdtdatahash" xmlns:w16sdtfl="http://schemas.microsoft.com/office/word/2024/wordml/sdtformatlock" xmlns:w16se="http://schemas.microsoft.com/office/word/2015/wordml/symex" xmlns:wpg="http://schemas.microsoft.com/office/word/2010/wordprocessingGroup" xmlns:wpi="http://schemas.microsoft.com/office/word/2010/wordprocessingInk" xmlns:wne="http://schemas.microsoft.com/office/word/2006/wordml" xmlns:wps="http://schemas.microsoft.com/office/word/2010/wordprocessingShape" mc:Ignorable="w14 w15 w16se w16cid w16 w16cex w16sdtdh w16sdtfl w16du wp14">
   <w:endnote w:type="separator" w:id="-1">
     <w:p>
       <w:r>
@@ -7238,7 +7010,7 @@
 </file>
 
 <file path=word/footer1.xml><?xml version="1.0" encoding="utf-8"?>
-<w:ftr xmlns:wpc="http://schemas.microsoft.com/office/word/2010/wordprocessingCanvas" xmlns:cx="http://schemas.microsoft.com/office/drawing/2014/chartex" xmlns:mc="http://schemas.openxmlformats.org/markup-compatibility/2006" xmlns:o="urn:schemas-microsoft-com:office:office" xmlns:r="http://schemas.openxmlformats.org/officeDocument/2006/relationships" xmlns:m="http://schemas.openxmlformats.org/officeDocument/2006/math" xmlns:v="urn:schemas-microsoft-com:vml" xmlns:wp14="http://schemas.microsoft.com/office/word/2010/wordprocessingDrawing" xmlns:wp="http://schemas.openxmlformats.org/drawingml/2006/wordprocessingDrawing" xmlns:w10="urn:schemas-microsoft-com:office:word" xmlns:w="http://schemas.openxmlformats.org/wordprocessingml/2006/main" xmlns:w14="http://schemas.microsoft.com/office/word/2010/wordml" xmlns:w15="http://schemas.microsoft.com/office/word/2012/wordml" xmlns:w16se="http://schemas.microsoft.com/office/word/2015/wordml/symex" xmlns:wpg="http://schemas.microsoft.com/office/word/2010/wordprocessingGroup" xmlns:wpi="http://schemas.microsoft.com/office/word/2010/wordprocessingInk" xmlns:wne="http://schemas.microsoft.com/office/word/2006/wordml" xmlns:wps="http://schemas.microsoft.com/office/word/2010/wordprocessingShape" mc:Ignorable="w14 w15 w16se wp14">
+<w:ftr xmlns:wpc="http://schemas.microsoft.com/office/word/2010/wordprocessingCanvas" xmlns:cx="http://schemas.microsoft.com/office/drawing/2014/chartex" xmlns:cx1="http://schemas.microsoft.com/office/drawing/2015/9/8/chartex" xmlns:cx2="http://schemas.microsoft.com/office/drawing/2015/10/21/chartex" xmlns:cx3="http://schemas.microsoft.com/office/drawing/2016/5/9/chartex" xmlns:cx4="http://schemas.microsoft.com/office/drawing/2016/5/10/chartex" xmlns:cx5="http://schemas.microsoft.com/office/drawing/2016/5/11/chartex" xmlns:cx6="http://schemas.microsoft.com/office/drawing/2016/5/12/chartex" xmlns:cx7="http://schemas.microsoft.com/office/drawing/2016/5/13/chartex" xmlns:cx8="http://schemas.microsoft.com/office/drawing/2016/5/14/chartex" xmlns:mc="http://schemas.openxmlformats.org/markup-compatibility/2006" xmlns:aink="http://schemas.microsoft.com/office/drawing/2016/ink" xmlns:am3d="http://schemas.microsoft.com/office/drawing/2017/model3d" xmlns:o="urn:schemas-microsoft-com:office:office" xmlns:oel="http://schemas.microsoft.com/office/2019/extlst" xmlns:r="http://schemas.openxmlformats.org/officeDocument/2006/relationships" xmlns:m="http://schemas.openxmlformats.org/officeDocument/2006/math" xmlns:v="urn:schemas-microsoft-com:vml" xmlns:wp14="http://schemas.microsoft.com/office/word/2010/wordprocessingDrawing" xmlns:wp="http://schemas.openxmlformats.org/drawingml/2006/wordprocessingDrawing" xmlns:w10="urn:schemas-microsoft-com:office:word" xmlns:w="http://schemas.openxmlformats.org/wordprocessingml/2006/main" xmlns:w14="http://schemas.microsoft.com/office/word/2010/wordml" xmlns:w15="http://schemas.microsoft.com/office/word/2012/wordml" xmlns:w16cex="http://schemas.microsoft.com/office/word/2018/wordml/cex" xmlns:w16cid="http://schemas.microsoft.com/office/word/2016/wordml/cid" xmlns:w16="http://schemas.microsoft.com/office/word/2018/wordml" xmlns:w16du="http://schemas.microsoft.com/office/word/2023/wordml/word16du" xmlns:w16sdtdh="http://schemas.microsoft.com/office/word/2020/wordml/sdtdatahash" xmlns:w16sdtfl="http://schemas.microsoft.com/office/word/2024/wordml/sdtformatlock" xmlns:w16se="http://schemas.microsoft.com/office/word/2015/wordml/symex" xmlns:wpg="http://schemas.microsoft.com/office/word/2010/wordprocessingGroup" xmlns:wpi="http://schemas.microsoft.com/office/word/2010/wordprocessingInk" xmlns:wne="http://schemas.microsoft.com/office/word/2006/wordml" xmlns:wps="http://schemas.microsoft.com/office/word/2010/wordprocessingShape" mc:Ignorable="w14 w15 w16se w16cid w16 w16cex w16sdtdh w16sdtfl w16du wp14">
   <w:tbl>
     <w:tblPr>
       <w:tblW w:w="0" w:type="auto"/>
@@ -7298,7 +7070,7 @@
 </file>
 
 <file path=word/footer2.xml><?xml version="1.0" encoding="utf-8"?>
-<w:ftr xmlns:wpc="http://schemas.microsoft.com/office/word/2010/wordprocessingCanvas" xmlns:cx="http://schemas.microsoft.com/office/drawing/2014/chartex" xmlns:mc="http://schemas.openxmlformats.org/markup-compatibility/2006" xmlns:o="urn:schemas-microsoft-com:office:office" xmlns:r="http://schemas.openxmlformats.org/officeDocument/2006/relationships" xmlns:m="http://schemas.openxmlformats.org/officeDocument/2006/math" xmlns:v="urn:schemas-microsoft-com:vml" xmlns:wp14="http://schemas.microsoft.com/office/word/2010/wordprocessingDrawing" xmlns:wp="http://schemas.openxmlformats.org/drawingml/2006/wordprocessingDrawing" xmlns:w10="urn:schemas-microsoft-com:office:word" xmlns:w="http://schemas.openxmlformats.org/wordprocessingml/2006/main" xmlns:w14="http://schemas.microsoft.com/office/word/2010/wordml" xmlns:w15="http://schemas.microsoft.com/office/word/2012/wordml" xmlns:w16se="http://schemas.microsoft.com/office/word/2015/wordml/symex" xmlns:wpg="http://schemas.microsoft.com/office/word/2010/wordprocessingGroup" xmlns:wpi="http://schemas.microsoft.com/office/word/2010/wordprocessingInk" xmlns:wne="http://schemas.microsoft.com/office/word/2006/wordml" xmlns:wps="http://schemas.microsoft.com/office/word/2010/wordprocessingShape" mc:Ignorable="w14 w15 w16se wp14">
+<w:ftr xmlns:wpc="http://schemas.microsoft.com/office/word/2010/wordprocessingCanvas" xmlns:cx="http://schemas.microsoft.com/office/drawing/2014/chartex" xmlns:cx1="http://schemas.microsoft.com/office/drawing/2015/9/8/chartex" xmlns:cx2="http://schemas.microsoft.com/office/drawing/2015/10/21/chartex" xmlns:cx3="http://schemas.microsoft.com/office/drawing/2016/5/9/chartex" xmlns:cx4="http://schemas.microsoft.com/office/drawing/2016/5/10/chartex" xmlns:cx5="http://schemas.microsoft.com/office/drawing/2016/5/11/chartex" xmlns:cx6="http://schemas.microsoft.com/office/drawing/2016/5/12/chartex" xmlns:cx7="http://schemas.microsoft.com/office/drawing/2016/5/13/chartex" xmlns:cx8="http://schemas.microsoft.com/office/drawing/2016/5/14/chartex" xmlns:mc="http://schemas.openxmlformats.org/markup-compatibility/2006" xmlns:aink="http://schemas.microsoft.com/office/drawing/2016/ink" xmlns:am3d="http://schemas.microsoft.com/office/drawing/2017/model3d" xmlns:o="urn:schemas-microsoft-com:office:office" xmlns:oel="http://schemas.microsoft.com/office/2019/extlst" xmlns:r="http://schemas.openxmlformats.org/officeDocument/2006/relationships" xmlns:m="http://schemas.openxmlformats.org/officeDocument/2006/math" xmlns:v="urn:schemas-microsoft-com:vml" xmlns:wp14="http://schemas.microsoft.com/office/word/2010/wordprocessingDrawing" xmlns:wp="http://schemas.openxmlformats.org/drawingml/2006/wordprocessingDrawing" xmlns:w10="urn:schemas-microsoft-com:office:word" xmlns:w="http://schemas.openxmlformats.org/wordprocessingml/2006/main" xmlns:w14="http://schemas.microsoft.com/office/word/2010/wordml" xmlns:w15="http://schemas.microsoft.com/office/word/2012/wordml" xmlns:w16cex="http://schemas.microsoft.com/office/word/2018/wordml/cex" xmlns:w16cid="http://schemas.microsoft.com/office/word/2016/wordml/cid" xmlns:w16="http://schemas.microsoft.com/office/word/2018/wordml" xmlns:w16du="http://schemas.microsoft.com/office/word/2023/wordml/word16du" xmlns:w16sdtdh="http://schemas.microsoft.com/office/word/2020/wordml/sdtdatahash" xmlns:w16sdtfl="http://schemas.microsoft.com/office/word/2024/wordml/sdtformatlock" xmlns:w16se="http://schemas.microsoft.com/office/word/2015/wordml/symex" xmlns:wpg="http://schemas.microsoft.com/office/word/2010/wordprocessingGroup" xmlns:wpi="http://schemas.microsoft.com/office/word/2010/wordprocessingInk" xmlns:wne="http://schemas.microsoft.com/office/word/2006/wordml" xmlns:wps="http://schemas.microsoft.com/office/word/2010/wordprocessingShape" mc:Ignorable="w14 w15 w16se w16cid w16 w16cex w16sdtdh w16sdtfl w16du wp14">
   <w:p>
     <w:pPr>
       <w:jc w:val="center"/>
@@ -7308,7 +7080,7 @@
 </file>
 
 <file path=word/footnotes.xml><?xml version="1.0" encoding="utf-8"?>
-<w:footnotes xmlns:wpc="http://schemas.microsoft.com/office/word/2010/wordprocessingCanvas" xmlns:cx="http://schemas.microsoft.com/office/drawing/2014/chartex" xmlns:mc="http://schemas.openxmlformats.org/markup-compatibility/2006" xmlns:o="urn:schemas-microsoft-com:office:office" xmlns:r="http://schemas.openxmlformats.org/officeDocument/2006/relationships" xmlns:m="http://schemas.openxmlformats.org/officeDocument/2006/math" xmlns:v="urn:schemas-microsoft-com:vml" xmlns:wp14="http://schemas.microsoft.com/office/word/2010/wordprocessingDrawing" xmlns:wp="http://schemas.openxmlformats.org/drawingml/2006/wordprocessingDrawing" xmlns:w10="urn:schemas-microsoft-com:office:word" xmlns:w="http://schemas.openxmlformats.org/wordprocessingml/2006/main" xmlns:w14="http://schemas.microsoft.com/office/word/2010/wordml" xmlns:w15="http://schemas.microsoft.com/office/word/2012/wordml" xmlns:w16se="http://schemas.microsoft.com/office/word/2015/wordml/symex" xmlns:wpg="http://schemas.microsoft.com/office/word/2010/wordprocessingGroup" xmlns:wpi="http://schemas.microsoft.com/office/word/2010/wordprocessingInk" xmlns:wne="http://schemas.microsoft.com/office/word/2006/wordml" xmlns:wps="http://schemas.microsoft.com/office/word/2010/wordprocessingShape" mc:Ignorable="w14 w15 w16se wp14">
+<w:footnotes xmlns:wpc="http://schemas.microsoft.com/office/word/2010/wordprocessingCanvas" xmlns:cx="http://schemas.microsoft.com/office/drawing/2014/chartex" xmlns:cx1="http://schemas.microsoft.com/office/drawing/2015/9/8/chartex" xmlns:cx2="http://schemas.microsoft.com/office/drawing/2015/10/21/chartex" xmlns:cx3="http://schemas.microsoft.com/office/drawing/2016/5/9/chartex" xmlns:cx4="http://schemas.microsoft.com/office/drawing/2016/5/10/chartex" xmlns:cx5="http://schemas.microsoft.com/office/drawing/2016/5/11/chartex" xmlns:cx6="http://schemas.microsoft.com/office/drawing/2016/5/12/chartex" xmlns:cx7="http://schemas.microsoft.com/office/drawing/2016/5/13/chartex" xmlns:cx8="http://schemas.microsoft.com/office/drawing/2016/5/14/chartex" xmlns:mc="http://schemas.openxmlformats.org/markup-compatibility/2006" xmlns:aink="http://schemas.microsoft.com/office/drawing/2016/ink" xmlns:am3d="http://schemas.microsoft.com/office/drawing/2017/model3d" xmlns:o="urn:schemas-microsoft-com:office:office" xmlns:oel="http://schemas.microsoft.com/office/2019/extlst" xmlns:r="http://schemas.openxmlformats.org/officeDocument/2006/relationships" xmlns:m="http://schemas.openxmlformats.org/officeDocument/2006/math" xmlns:v="urn:schemas-microsoft-com:vml" xmlns:wp14="http://schemas.microsoft.com/office/word/2010/wordprocessingDrawing" xmlns:wp="http://schemas.openxmlformats.org/drawingml/2006/wordprocessingDrawing" xmlns:w10="urn:schemas-microsoft-com:office:word" xmlns:w="http://schemas.openxmlformats.org/wordprocessingml/2006/main" xmlns:w14="http://schemas.microsoft.com/office/word/2010/wordml" xmlns:w15="http://schemas.microsoft.com/office/word/2012/wordml" xmlns:w16cex="http://schemas.microsoft.com/office/word/2018/wordml/cex" xmlns:w16cid="http://schemas.microsoft.com/office/word/2016/wordml/cid" xmlns:w16="http://schemas.microsoft.com/office/word/2018/wordml" xmlns:w16du="http://schemas.microsoft.com/office/word/2023/wordml/word16du" xmlns:w16sdtdh="http://schemas.microsoft.com/office/word/2020/wordml/sdtdatahash" xmlns:w16sdtfl="http://schemas.microsoft.com/office/word/2024/wordml/sdtformatlock" xmlns:w16se="http://schemas.microsoft.com/office/word/2015/wordml/symex" xmlns:wpg="http://schemas.microsoft.com/office/word/2010/wordprocessingGroup" xmlns:wpi="http://schemas.microsoft.com/office/word/2010/wordprocessingInk" xmlns:wne="http://schemas.microsoft.com/office/word/2006/wordml" xmlns:wps="http://schemas.microsoft.com/office/word/2010/wordprocessingShape" mc:Ignorable="w14 w15 w16se w16cid w16 w16cex w16sdtdh w16sdtfl w16du wp14">
   <w:footnote w:type="separator" w:id="-1">
     <w:p>
       <w:r>
@@ -7327,7 +7099,7 @@
 </file>
 
 <file path=word/header1.xml><?xml version="1.0" encoding="utf-8"?>
-<w:hdr xmlns:wpc="http://schemas.microsoft.com/office/word/2010/wordprocessingCanvas" xmlns:cx="http://schemas.microsoft.com/office/drawing/2014/chartex" xmlns:mc="http://schemas.openxmlformats.org/markup-compatibility/2006" xmlns:o="urn:schemas-microsoft-com:office:office" xmlns:r="http://schemas.openxmlformats.org/officeDocument/2006/relationships" xmlns:m="http://schemas.openxmlformats.org/officeDocument/2006/math" xmlns:v="urn:schemas-microsoft-com:vml" xmlns:wp14="http://schemas.microsoft.com/office/word/2010/wordprocessingDrawing" xmlns:wp="http://schemas.openxmlformats.org/drawingml/2006/wordprocessingDrawing" xmlns:w10="urn:schemas-microsoft-com:office:word" xmlns:w="http://schemas.openxmlformats.org/wordprocessingml/2006/main" xmlns:w14="http://schemas.microsoft.com/office/word/2010/wordml" xmlns:w15="http://schemas.microsoft.com/office/word/2012/wordml" xmlns:w16se="http://schemas.microsoft.com/office/word/2015/wordml/symex" xmlns:wpg="http://schemas.microsoft.com/office/word/2010/wordprocessingGroup" xmlns:wpi="http://schemas.microsoft.com/office/word/2010/wordprocessingInk" xmlns:wne="http://schemas.microsoft.com/office/word/2006/wordml" xmlns:wps="http://schemas.microsoft.com/office/word/2010/wordprocessingShape" mc:Ignorable="w14 w15 w16se wp14">
+<w:hdr xmlns:wpc="http://schemas.microsoft.com/office/word/2010/wordprocessingCanvas" xmlns:cx="http://schemas.microsoft.com/office/drawing/2014/chartex" xmlns:cx1="http://schemas.microsoft.com/office/drawing/2015/9/8/chartex" xmlns:cx2="http://schemas.microsoft.com/office/drawing/2015/10/21/chartex" xmlns:cx3="http://schemas.microsoft.com/office/drawing/2016/5/9/chartex" xmlns:cx4="http://schemas.microsoft.com/office/drawing/2016/5/10/chartex" xmlns:cx5="http://schemas.microsoft.com/office/drawing/2016/5/11/chartex" xmlns:cx6="http://schemas.microsoft.com/office/drawing/2016/5/12/chartex" xmlns:cx7="http://schemas.microsoft.com/office/drawing/2016/5/13/chartex" xmlns:cx8="http://schemas.microsoft.com/office/drawing/2016/5/14/chartex" xmlns:mc="http://schemas.openxmlformats.org/markup-compatibility/2006" xmlns:aink="http://schemas.microsoft.com/office/drawing/2016/ink" xmlns:am3d="http://schemas.microsoft.com/office/drawing/2017/model3d" xmlns:o="urn:schemas-microsoft-com:office:office" xmlns:oel="http://schemas.microsoft.com/office/2019/extlst" xmlns:r="http://schemas.openxmlformats.org/officeDocument/2006/relationships" xmlns:m="http://schemas.openxmlformats.org/officeDocument/2006/math" xmlns:v="urn:schemas-microsoft-com:vml" xmlns:wp14="http://schemas.microsoft.com/office/word/2010/wordprocessingDrawing" xmlns:wp="http://schemas.openxmlformats.org/drawingml/2006/wordprocessingDrawing" xmlns:w10="urn:schemas-microsoft-com:office:word" xmlns:w="http://schemas.openxmlformats.org/wordprocessingml/2006/main" xmlns:w14="http://schemas.microsoft.com/office/word/2010/wordml" xmlns:w15="http://schemas.microsoft.com/office/word/2012/wordml" xmlns:w16cex="http://schemas.microsoft.com/office/word/2018/wordml/cex" xmlns:w16cid="http://schemas.microsoft.com/office/word/2016/wordml/cid" xmlns:w16="http://schemas.microsoft.com/office/word/2018/wordml" xmlns:w16du="http://schemas.microsoft.com/office/word/2023/wordml/word16du" xmlns:w16sdtdh="http://schemas.microsoft.com/office/word/2020/wordml/sdtdatahash" xmlns:w16sdtfl="http://schemas.microsoft.com/office/word/2024/wordml/sdtformatlock" xmlns:w16se="http://schemas.microsoft.com/office/word/2015/wordml/symex" xmlns:wpg="http://schemas.microsoft.com/office/word/2010/wordprocessingGroup" xmlns:wpi="http://schemas.microsoft.com/office/word/2010/wordprocessingInk" xmlns:wne="http://schemas.microsoft.com/office/word/2006/wordml" xmlns:wps="http://schemas.microsoft.com/office/word/2010/wordprocessingShape" mc:Ignorable="w14 w15 w16se w16cid w16 w16cex w16sdtdh w16sdtfl w16du wp14">
   <w:tbl>
     <w:tblPr>
       <w:tblW w:w="0" w:type="auto"/>
@@ -7387,7 +7159,7 @@
 </file>
 
 <file path=word/header2.xml><?xml version="1.0" encoding="utf-8"?>
-<w:hdr xmlns:wpc="http://schemas.microsoft.com/office/word/2010/wordprocessingCanvas" xmlns:cx="http://schemas.microsoft.com/office/drawing/2014/chartex" xmlns:mc="http://schemas.openxmlformats.org/markup-compatibility/2006" xmlns:o="urn:schemas-microsoft-com:office:office" xmlns:r="http://schemas.openxmlformats.org/officeDocument/2006/relationships" xmlns:m="http://schemas.openxmlformats.org/officeDocument/2006/math" xmlns:v="urn:schemas-microsoft-com:vml" xmlns:wp14="http://schemas.microsoft.com/office/word/2010/wordprocessingDrawing" xmlns:wp="http://schemas.openxmlformats.org/drawingml/2006/wordprocessingDrawing" xmlns:w10="urn:schemas-microsoft-com:office:word" xmlns:w="http://schemas.openxmlformats.org/wordprocessingml/2006/main" xmlns:w14="http://schemas.microsoft.com/office/word/2010/wordml" xmlns:w15="http://schemas.microsoft.com/office/word/2012/wordml" xmlns:w16se="http://schemas.microsoft.com/office/word/2015/wordml/symex" xmlns:wpg="http://schemas.microsoft.com/office/word/2010/wordprocessingGroup" xmlns:wpi="http://schemas.microsoft.com/office/word/2010/wordprocessingInk" xmlns:wne="http://schemas.microsoft.com/office/word/2006/wordml" xmlns:wps="http://schemas.microsoft.com/office/word/2010/wordprocessingShape" mc:Ignorable="w14 w15 w16se wp14">
+<w:hdr xmlns:wpc="http://schemas.microsoft.com/office/word/2010/wordprocessingCanvas" xmlns:cx="http://schemas.microsoft.com/office/drawing/2014/chartex" xmlns:cx1="http://schemas.microsoft.com/office/drawing/2015/9/8/chartex" xmlns:cx2="http://schemas.microsoft.com/office/drawing/2015/10/21/chartex" xmlns:cx3="http://schemas.microsoft.com/office/drawing/2016/5/9/chartex" xmlns:cx4="http://schemas.microsoft.com/office/drawing/2016/5/10/chartex" xmlns:cx5="http://schemas.microsoft.com/office/drawing/2016/5/11/chartex" xmlns:cx6="http://schemas.microsoft.com/office/drawing/2016/5/12/chartex" xmlns:cx7="http://schemas.microsoft.com/office/drawing/2016/5/13/chartex" xmlns:cx8="http://schemas.microsoft.com/office/drawing/2016/5/14/chartex" xmlns:mc="http://schemas.openxmlformats.org/markup-compatibility/2006" xmlns:aink="http://schemas.microsoft.com/office/drawing/2016/ink" xmlns:am3d="http://schemas.microsoft.com/office/drawing/2017/model3d" xmlns:o="urn:schemas-microsoft-com:office:office" xmlns:oel="http://schemas.microsoft.com/office/2019/extlst" xmlns:r="http://schemas.openxmlformats.org/officeDocument/2006/relationships" xmlns:m="http://schemas.openxmlformats.org/officeDocument/2006/math" xmlns:v="urn:schemas-microsoft-com:vml" xmlns:wp14="http://schemas.microsoft.com/office/word/2010/wordprocessingDrawing" xmlns:wp="http://schemas.openxmlformats.org/drawingml/2006/wordprocessingDrawing" xmlns:w10="urn:schemas-microsoft-com:office:word" xmlns:w="http://schemas.openxmlformats.org/wordprocessingml/2006/main" xmlns:w14="http://schemas.microsoft.com/office/word/2010/wordml" xmlns:w15="http://schemas.microsoft.com/office/word/2012/wordml" xmlns:w16cex="http://schemas.microsoft.com/office/word/2018/wordml/cex" xmlns:w16cid="http://schemas.microsoft.com/office/word/2016/wordml/cid" xmlns:w16="http://schemas.microsoft.com/office/word/2018/wordml" xmlns:w16du="http://schemas.microsoft.com/office/word/2023/wordml/word16du" xmlns:w16sdtdh="http://schemas.microsoft.com/office/word/2020/wordml/sdtdatahash" xmlns:w16sdtfl="http://schemas.microsoft.com/office/word/2024/wordml/sdtformatlock" xmlns:w16se="http://schemas.microsoft.com/office/word/2015/wordml/symex" xmlns:wpg="http://schemas.microsoft.com/office/word/2010/wordprocessingGroup" xmlns:wpi="http://schemas.microsoft.com/office/word/2010/wordprocessingInk" xmlns:wne="http://schemas.microsoft.com/office/word/2006/wordml" xmlns:wps="http://schemas.microsoft.com/office/word/2010/wordprocessingShape" mc:Ignorable="w14 w15 w16se w16cid w16 w16cex w16sdtdh w16sdtfl w16du wp14">
   <w:p>
     <w:pPr>
       <w:jc w:val="right"/>
@@ -7397,7 +7169,7 @@
 </file>
 
 <file path=word/numbering.xml><?xml version="1.0" encoding="utf-8"?>
-<w:numbering xmlns:wpc="http://schemas.microsoft.com/office/word/2010/wordprocessingCanvas" xmlns:cx="http://schemas.microsoft.com/office/drawing/2014/chartex" xmlns:mc="http://schemas.openxmlformats.org/markup-compatibility/2006" xmlns:o="urn:schemas-microsoft-com:office:office" xmlns:r="http://schemas.openxmlformats.org/officeDocument/2006/relationships" xmlns:m="http://schemas.openxmlformats.org/officeDocument/2006/math" xmlns:v="urn:schemas-microsoft-com:vml" xmlns:wp14="http://schemas.microsoft.com/office/word/2010/wordprocessingDrawing" xmlns:wp="http://schemas.openxmlformats.org/drawingml/2006/wordprocessingDrawing" xmlns:w10="urn:schemas-microsoft-com:office:word" xmlns:w="http://schemas.openxmlformats.org/wordprocessingml/2006/main" xmlns:w14="http://schemas.microsoft.com/office/word/2010/wordml" xmlns:w15="http://schemas.microsoft.com/office/word/2012/wordml" xmlns:w16se="http://schemas.microsoft.com/office/word/2015/wordml/symex" xmlns:wpg="http://schemas.microsoft.com/office/word/2010/wordprocessingGroup" xmlns:wpi="http://schemas.microsoft.com/office/word/2010/wordprocessingInk" xmlns:wne="http://schemas.microsoft.com/office/word/2006/wordml" xmlns:wps="http://schemas.microsoft.com/office/word/2010/wordprocessingShape" mc:Ignorable="w14 w15 w16se wp14">
+<w:numbering xmlns:wpc="http://schemas.microsoft.com/office/word/2010/wordprocessingCanvas" xmlns:cx="http://schemas.microsoft.com/office/drawing/2014/chartex" xmlns:cx1="http://schemas.microsoft.com/office/drawing/2015/9/8/chartex" xmlns:cx2="http://schemas.microsoft.com/office/drawing/2015/10/21/chartex" xmlns:cx3="http://schemas.microsoft.com/office/drawing/2016/5/9/chartex" xmlns:cx4="http://schemas.microsoft.com/office/drawing/2016/5/10/chartex" xmlns:cx5="http://schemas.microsoft.com/office/drawing/2016/5/11/chartex" xmlns:cx6="http://schemas.microsoft.com/office/drawing/2016/5/12/chartex" xmlns:cx7="http://schemas.microsoft.com/office/drawing/2016/5/13/chartex" xmlns:cx8="http://schemas.microsoft.com/office/drawing/2016/5/14/chartex" xmlns:mc="http://schemas.openxmlformats.org/markup-compatibility/2006" xmlns:aink="http://schemas.microsoft.com/office/drawing/2016/ink" xmlns:am3d="http://schemas.microsoft.com/office/drawing/2017/model3d" xmlns:o="urn:schemas-microsoft-com:office:office" xmlns:oel="http://schemas.microsoft.com/office/2019/extlst" xmlns:r="http://schemas.openxmlformats.org/officeDocument/2006/relationships" xmlns:m="http://schemas.openxmlformats.org/officeDocument/2006/math" xmlns:v="urn:schemas-microsoft-com:vml" xmlns:wp14="http://schemas.microsoft.com/office/word/2010/wordprocessingDrawing" xmlns:wp="http://schemas.openxmlformats.org/drawingml/2006/wordprocessingDrawing" xmlns:w10="urn:schemas-microsoft-com:office:word" xmlns:w="http://schemas.openxmlformats.org/wordprocessingml/2006/main" xmlns:w14="http://schemas.microsoft.com/office/word/2010/wordml" xmlns:w15="http://schemas.microsoft.com/office/word/2012/wordml" xmlns:w16cex="http://schemas.microsoft.com/office/word/2018/wordml/cex" xmlns:w16cid="http://schemas.microsoft.com/office/word/2016/wordml/cid" xmlns:w16="http://schemas.microsoft.com/office/word/2018/wordml" xmlns:w16du="http://schemas.microsoft.com/office/word/2023/wordml/word16du" xmlns:w16sdtdh="http://schemas.microsoft.com/office/word/2020/wordml/sdtdatahash" xmlns:w16sdtfl="http://schemas.microsoft.com/office/word/2024/wordml/sdtformatlock" xmlns:w16se="http://schemas.microsoft.com/office/word/2015/wordml/symex" xmlns:wpg="http://schemas.microsoft.com/office/word/2010/wordprocessingGroup" xmlns:wpi="http://schemas.microsoft.com/office/word/2010/wordprocessingInk" xmlns:wne="http://schemas.microsoft.com/office/word/2006/wordml" xmlns:wps="http://schemas.microsoft.com/office/word/2010/wordprocessingShape" mc:Ignorable="w14 w15 w16se w16cid w16 w16cex w16sdtdh w16sdtfl w16du wp14">
   <w:abstractNum w:abstractNumId="0" w15:restartNumberingAfterBreak="0">
     <w:nsid w:val="051D130A"/>
     <w:multiLevelType w:val="hybridMultilevel"/>
@@ -7592,19 +7364,19 @@
       <w:lvlJc w:val="left"/>
     </w:lvl>
   </w:abstractNum>
-  <w:num w:numId="1">
+  <w:num w:numId="1" w16cid:durableId="536353233">
     <w:abstractNumId w:val="1"/>
     <w:lvlOverride w:ilvl="0">
       <w:startOverride w:val="1"/>
     </w:lvlOverride>
   </w:num>
-  <w:num w:numId="2">
+  <w:num w:numId="2" w16cid:durableId="1329360066">
     <w:abstractNumId w:val="2"/>
     <w:lvlOverride w:ilvl="0">
       <w:startOverride w:val="1"/>
     </w:lvlOverride>
   </w:num>
-  <w:num w:numId="3">
+  <w:num w:numId="3" w16cid:durableId="1262372174">
     <w:abstractNumId w:val="0"/>
     <w:lvlOverride w:ilvl="0">
       <w:startOverride w:val="1"/>
@@ -7614,7 +7386,7 @@
 </file>
 
 <file path=word/styles.xml><?xml version="1.0" encoding="utf-8"?>
-<w:styles xmlns:mc="http://schemas.openxmlformats.org/markup-compatibility/2006" xmlns:r="http://schemas.openxmlformats.org/officeDocument/2006/relationships" xmlns:w="http://schemas.openxmlformats.org/wordprocessingml/2006/main" xmlns:w14="http://schemas.microsoft.com/office/word/2010/wordml" xmlns:w15="http://schemas.microsoft.com/office/word/2012/wordml" xmlns:w16se="http://schemas.microsoft.com/office/word/2015/wordml/symex" mc:Ignorable="w14 w15 w16se">
+<w:styles xmlns:mc="http://schemas.openxmlformats.org/markup-compatibility/2006" xmlns:r="http://schemas.openxmlformats.org/officeDocument/2006/relationships" xmlns:w="http://schemas.openxmlformats.org/wordprocessingml/2006/main" xmlns:w14="http://schemas.microsoft.com/office/word/2010/wordml" xmlns:w15="http://schemas.microsoft.com/office/word/2012/wordml" xmlns:w16cex="http://schemas.microsoft.com/office/word/2018/wordml/cex" xmlns:w16cid="http://schemas.microsoft.com/office/word/2016/wordml/cid" xmlns:w16="http://schemas.microsoft.com/office/word/2018/wordml" xmlns:w16du="http://schemas.microsoft.com/office/word/2023/wordml/word16du" xmlns:w16sdtdh="http://schemas.microsoft.com/office/word/2020/wordml/sdtdatahash" xmlns:w16sdtfl="http://schemas.microsoft.com/office/word/2024/wordml/sdtformatlock" xmlns:w16se="http://schemas.microsoft.com/office/word/2015/wordml/symex" mc:Ignorable="w14 w15 w16se w16cid w16 w16cex w16sdtdh w16sdtfl w16du">
   <w:docDefaults>
     <w:rPrDefault>
       <w:rPr>
@@ -7626,7 +7398,7 @@
     </w:rPrDefault>
     <w:pPrDefault/>
   </w:docDefaults>
-  <w:latentStyles w:defLockedState="0" w:defUIPriority="99" w:defSemiHidden="0" w:defUnhideWhenUsed="0" w:defQFormat="0" w:count="371">
+  <w:latentStyles w:defLockedState="0" w:defUIPriority="99" w:defSemiHidden="0" w:defUnhideWhenUsed="0" w:defQFormat="0" w:count="376">
     <w:lsdException w:name="Normal" w:uiPriority="0" w:qFormat="1"/>
     <w:lsdException w:name="heading 1" w:uiPriority="9" w:qFormat="1"/>
     <w:lsdException w:name="heading 2" w:semiHidden="1" w:uiPriority="9" w:unhideWhenUsed="1" w:qFormat="1"/>
@@ -7998,6 +7770,11 @@
     <w:lsdException w:name="List Table 5 Dark Accent 6" w:uiPriority="50"/>
     <w:lsdException w:name="List Table 6 Colorful Accent 6" w:uiPriority="51"/>
     <w:lsdException w:name="List Table 7 Colorful Accent 6" w:uiPriority="52"/>
+    <w:lsdException w:name="Mention" w:semiHidden="1" w:unhideWhenUsed="1"/>
+    <w:lsdException w:name="Smart Hyperlink" w:semiHidden="1" w:unhideWhenUsed="1"/>
+    <w:lsdException w:name="Hashtag" w:semiHidden="1" w:unhideWhenUsed="1"/>
+    <w:lsdException w:name="Unresolved Mention" w:semiHidden="1" w:unhideWhenUsed="1"/>
+    <w:lsdException w:name="Smart Link" w:semiHidden="1" w:unhideWhenUsed="1"/>
   </w:latentStyles>
   <w:style w:type="paragraph" w:default="1" w:styleId="Normal">
     <w:name w:val="Normal"/>

</xml_diff>